<commit_message>
vault backup: 2026-05-09 01:43:38
</commit_message>
<xml_diff>
--- a/Учеба 4 семестр/Теория вероятности/Курсовая работа/Отчет, Код/Курсовая_работа.docx
+++ b/Учеба 4 семестр/Теория вероятности/Курсовая работа/Отчет, Код/Курсовая_работа.docx
@@ -293,7 +293,23 @@
           <w:szCs w:val="28"/>
         </w:rPr>
         <w:tab/>
-        <w:t xml:space="preserve">&lt;подпись&gt;    </w:t>
+        <w:t>&lt;</w:t>
+      </w:r>
+      <w:proofErr w:type="gramStart"/>
+      <w:r>
+        <w:rPr>
+          <w:sz w:val="28"/>
+          <w:szCs w:val="28"/>
+        </w:rPr>
+        <w:t xml:space="preserve">подпись&gt;   </w:t>
+      </w:r>
+      <w:proofErr w:type="gramEnd"/>
+      <w:r>
+        <w:rPr>
+          <w:sz w:val="28"/>
+          <w:szCs w:val="28"/>
+        </w:rPr>
+        <w:t xml:space="preserve"> </w:t>
       </w:r>
       <w:r>
         <w:rPr>
@@ -1695,7 +1711,23 @@
           <w:sz w:val="28"/>
           <w:szCs w:val="28"/>
         </w:rPr>
-        <w:t>Объектом исследования является выборка случайной величины, подчиняющейся двойному гамма распределению. Предметом исследования — статистические свойства данной выборки и методы её анализа.</w:t>
+        <w:t xml:space="preserve">Объектом исследования является выборка случайной величины, подчиняющейся </w:t>
+      </w:r>
+      <w:proofErr w:type="gramStart"/>
+      <w:r>
+        <w:rPr>
+          <w:sz w:val="28"/>
+          <w:szCs w:val="28"/>
+        </w:rPr>
+        <w:t>двойному</w:t>
+      </w:r>
+      <w:proofErr w:type="gramEnd"/>
+      <w:r>
+        <w:rPr>
+          <w:sz w:val="28"/>
+          <w:szCs w:val="28"/>
+        </w:rPr>
+        <w:t xml:space="preserve"> гамма распределению. Предметом исследования — статистические свойства данной выборки и методы её анализа.</w:t>
       </w:r>
     </w:p>
     <w:p>
@@ -1969,6 +2001,7 @@
         <m:oMath>
           <m:r>
             <w:rPr>
+              <w:rFonts w:ascii="Cambria Math" w:hAnsi="Cambria Math"/>
               <w:sz w:val="28"/>
               <w:szCs w:val="28"/>
             </w:rPr>
@@ -1978,6 +2011,7 @@
             <m:fPr>
               <m:ctrlPr>
                 <w:rPr>
+                  <w:rFonts w:ascii="Cambria Math" w:hAnsi="Cambria Math"/>
                   <w:sz w:val="28"/>
                   <w:szCs w:val="28"/>
                 </w:rPr>
@@ -1988,6 +2022,7 @@
                 <m:sSupPr>
                   <m:ctrlPr>
                     <w:rPr>
+                      <w:rFonts w:ascii="Cambria Math" w:hAnsi="Cambria Math"/>
                       <w:sz w:val="28"/>
                       <w:szCs w:val="28"/>
                     </w:rPr>
@@ -1996,6 +2031,7 @@
                 <m:e>
                   <m:r>
                     <w:rPr>
+                      <w:rFonts w:ascii="Cambria Math" w:hAnsi="Cambria Math"/>
                       <w:sz w:val="28"/>
                       <w:szCs w:val="28"/>
                     </w:rPr>
@@ -2005,6 +2041,7 @@
                 <m:sup>
                   <m:r>
                     <w:rPr>
+                      <w:rFonts w:ascii="Cambria Math" w:hAnsi="Cambria Math"/>
                       <w:sz w:val="28"/>
                       <w:szCs w:val="28"/>
                     </w:rPr>
@@ -2016,6 +2053,7 @@
             <m:den>
               <m:r>
                 <w:rPr>
+                  <w:rFonts w:ascii="Cambria Math" w:hAnsi="Cambria Math"/>
                   <w:sz w:val="28"/>
                   <w:szCs w:val="28"/>
                 </w:rPr>
@@ -2027,6 +2065,7 @@
             <m:sSupPr>
               <m:ctrlPr>
                 <w:rPr>
+                  <w:rFonts w:ascii="Cambria Math" w:hAnsi="Cambria Math"/>
                   <w:sz w:val="28"/>
                   <w:szCs w:val="28"/>
                 </w:rPr>
@@ -2035,6 +2074,7 @@
             <m:e>
               <m:r>
                 <w:rPr>
+                  <w:rFonts w:ascii="Cambria Math" w:hAnsi="Cambria Math"/>
                   <w:sz w:val="28"/>
                   <w:szCs w:val="28"/>
                 </w:rPr>
@@ -2042,6 +2082,7 @@
               </m:r>
               <m:r>
                 <w:rPr>
+                  <w:rFonts w:ascii="Cambria Math" w:hAnsi="Cambria Math"/>
                   <w:sz w:val="28"/>
                   <w:szCs w:val="28"/>
                   <w:lang w:val="en-US"/>
@@ -2050,6 +2091,7 @@
               </m:r>
               <m:r>
                 <w:rPr>
+                  <w:rFonts w:ascii="Cambria Math" w:hAnsi="Cambria Math"/>
                   <w:sz w:val="28"/>
                   <w:szCs w:val="28"/>
                 </w:rPr>
@@ -2059,6 +2101,7 @@
             <m:sup>
               <m:r>
                 <w:rPr>
+                  <w:rFonts w:ascii="Cambria Math" w:hAnsi="Cambria Math"/>
                   <w:sz w:val="28"/>
                   <w:szCs w:val="28"/>
                 </w:rPr>
@@ -2070,6 +2113,7 @@
             <m:sSupPr>
               <m:ctrlPr>
                 <w:rPr>
+                  <w:rFonts w:ascii="Cambria Math" w:hAnsi="Cambria Math"/>
                   <w:sz w:val="28"/>
                   <w:szCs w:val="28"/>
                 </w:rPr>
@@ -2078,6 +2122,7 @@
             <m:e>
               <m:r>
                 <w:rPr>
+                  <w:rFonts w:ascii="Cambria Math" w:hAnsi="Cambria Math"/>
                   <w:sz w:val="28"/>
                   <w:szCs w:val="28"/>
                 </w:rPr>
@@ -2087,6 +2132,7 @@
             <m:sup>
               <m:r>
                 <w:rPr>
+                  <w:rFonts w:ascii="Cambria Math" w:hAnsi="Cambria Math"/>
                   <w:sz w:val="28"/>
                   <w:szCs w:val="28"/>
                 </w:rPr>
@@ -2094,6 +2140,7 @@
               </m:r>
               <m:r>
                 <w:rPr>
+                  <w:rFonts w:ascii="Cambria Math" w:hAnsi="Cambria Math"/>
                   <w:sz w:val="28"/>
                   <w:szCs w:val="28"/>
                   <w:lang w:val="en-US"/>
@@ -2102,6 +2149,7 @@
               </m:r>
               <m:r>
                 <w:rPr>
+                  <w:rFonts w:ascii="Cambria Math" w:hAnsi="Cambria Math"/>
                   <w:sz w:val="28"/>
                   <w:szCs w:val="28"/>
                 </w:rPr>
@@ -2145,6 +2193,7 @@
         </w:rPr>
         <w:t xml:space="preserve">•  </w:t>
       </w:r>
+      <w:proofErr w:type="gramStart"/>
       <w:r>
         <w:rPr>
           <w:i/>
@@ -2159,7 +2208,15 @@
           <w:sz w:val="28"/>
           <w:szCs w:val="28"/>
         </w:rPr>
-        <w:t xml:space="preserve"> &gt; 0 — параметр формы,</w:t>
+        <w:t xml:space="preserve"> &gt;</w:t>
+      </w:r>
+      <w:proofErr w:type="gramEnd"/>
+      <w:r>
+        <w:rPr>
+          <w:sz w:val="28"/>
+          <w:szCs w:val="28"/>
+        </w:rPr>
+        <w:t xml:space="preserve"> 0 — параметр формы,</w:t>
       </w:r>
     </w:p>
     <w:p>
@@ -2178,6 +2235,7 @@
         </w:rPr>
         <w:t xml:space="preserve">•  </w:t>
       </w:r>
+      <w:proofErr w:type="gramStart"/>
       <w:r>
         <w:rPr>
           <w:i/>
@@ -2192,7 +2250,15 @@
           <w:sz w:val="28"/>
           <w:szCs w:val="28"/>
         </w:rPr>
-        <w:t xml:space="preserve"> &gt; 0 — параметр масштаба,</w:t>
+        <w:t xml:space="preserve"> &gt;</w:t>
+      </w:r>
+      <w:proofErr w:type="gramEnd"/>
+      <w:r>
+        <w:rPr>
+          <w:sz w:val="28"/>
+          <w:szCs w:val="28"/>
+        </w:rPr>
+        <w:t xml:space="preserve"> 0 — параметр масштаба,</w:t>
       </w:r>
     </w:p>
     <w:p>
@@ -3786,7 +3852,15 @@
           <w:sz w:val="28"/>
           <w:szCs w:val="28"/>
         </w:rPr>
-        <w:t xml:space="preserve"> — выборка из распределения F(x), X</w:t>
+        <w:t xml:space="preserve"> — выборка из распределения F(x), </w:t>
+      </w:r>
+      <w:proofErr w:type="gramStart"/>
+      <w:r>
+        <w:rPr>
+          <w:sz w:val="28"/>
+          <w:szCs w:val="28"/>
+        </w:rPr>
+        <w:t>X</w:t>
       </w:r>
       <w:r>
         <w:rPr>
@@ -3794,7 +3868,16 @@
           <w:szCs w:val="28"/>
           <w:vertAlign w:val="subscript"/>
         </w:rPr>
-        <w:t>(1)</w:t>
+        <w:t>(</w:t>
+      </w:r>
+      <w:proofErr w:type="gramEnd"/>
+      <w:r>
+        <w:rPr>
+          <w:sz w:val="28"/>
+          <w:szCs w:val="28"/>
+          <w:vertAlign w:val="subscript"/>
+        </w:rPr>
+        <w:t>1)</w:t>
       </w:r>
       <w:r>
         <w:rPr>
@@ -3993,7 +4076,15 @@
           <w:sz w:val="28"/>
           <w:szCs w:val="28"/>
         </w:rPr>
-        <w:t xml:space="preserve">ᵢ &lt; </w:t>
+        <w:t xml:space="preserve">ᵢ </w:t>
+      </w:r>
+      <w:proofErr w:type="gramStart"/>
+      <w:r>
+        <w:rPr>
+          <w:sz w:val="28"/>
+          <w:szCs w:val="28"/>
+        </w:rPr>
+        <w:t xml:space="preserve">&lt; </w:t>
       </w:r>
       <w:r>
         <w:rPr>
@@ -4004,6 +4095,7 @@
         </w:rPr>
         <w:t>x</w:t>
       </w:r>
+      <w:proofErr w:type="gramEnd"/>
       <w:r>
         <w:rPr>
           <w:sz w:val="28"/>
@@ -4029,6 +4121,7 @@
             <m:sSubPr>
               <m:ctrlPr>
                 <w:rPr>
+                  <w:rFonts w:ascii="Cambria Math" w:hAnsi="Cambria Math"/>
                   <w:sz w:val="28"/>
                   <w:szCs w:val="28"/>
                 </w:rPr>
@@ -4037,6 +4130,7 @@
             <m:e>
               <m:r>
                 <w:rPr>
+                  <w:rFonts w:ascii="Cambria Math" w:hAnsi="Cambria Math"/>
                   <w:sz w:val="28"/>
                   <w:szCs w:val="28"/>
                 </w:rPr>
@@ -4046,6 +4140,7 @@
             <m:sub>
               <m:r>
                 <w:rPr>
+                  <w:rFonts w:ascii="Cambria Math" w:hAnsi="Cambria Math"/>
                   <w:sz w:val="28"/>
                   <w:szCs w:val="28"/>
                 </w:rPr>
@@ -4055,6 +4150,7 @@
           </m:sSub>
           <m:r>
             <w:rPr>
+              <w:rFonts w:ascii="Cambria Math" w:hAnsi="Cambria Math"/>
               <w:sz w:val="28"/>
               <w:szCs w:val="28"/>
             </w:rPr>
@@ -4064,6 +4160,7 @@
             <m:fPr>
               <m:ctrlPr>
                 <w:rPr>
+                  <w:rFonts w:ascii="Cambria Math" w:hAnsi="Cambria Math"/>
                   <w:sz w:val="28"/>
                   <w:szCs w:val="28"/>
                 </w:rPr>
@@ -4074,6 +4171,7 @@
                 <m:sSubPr>
                   <m:ctrlPr>
                     <w:rPr>
+                      <w:rFonts w:ascii="Cambria Math" w:hAnsi="Cambria Math"/>
                       <w:sz w:val="28"/>
                       <w:szCs w:val="28"/>
                     </w:rPr>
@@ -4082,6 +4180,7 @@
                 <m:e>
                   <m:r>
                     <w:rPr>
+                      <w:rFonts w:ascii="Cambria Math" w:hAnsi="Cambria Math"/>
                       <w:sz w:val="28"/>
                       <w:szCs w:val="28"/>
                     </w:rPr>
@@ -4091,6 +4190,7 @@
                 <m:sub>
                   <m:r>
                     <w:rPr>
+                      <w:rFonts w:ascii="Cambria Math" w:hAnsi="Cambria Math"/>
                       <w:sz w:val="28"/>
                       <w:szCs w:val="28"/>
                     </w:rPr>
@@ -4100,6 +4200,7 @@
               </m:sSub>
               <m:r>
                 <w:rPr>
+                  <w:rFonts w:ascii="Cambria Math" w:hAnsi="Cambria Math"/>
                   <w:sz w:val="28"/>
                   <w:szCs w:val="28"/>
                 </w:rPr>
@@ -4109,6 +4210,7 @@
             <m:den>
               <m:r>
                 <w:rPr>
+                  <w:rFonts w:ascii="Cambria Math" w:hAnsi="Cambria Math"/>
                   <w:sz w:val="28"/>
                   <w:szCs w:val="28"/>
                 </w:rPr>
@@ -4150,6 +4252,7 @@
             <m:sSubPr>
               <m:ctrlPr>
                 <w:rPr>
+                  <w:rFonts w:ascii="Cambria Math" w:hAnsi="Cambria Math"/>
                   <w:sz w:val="28"/>
                   <w:szCs w:val="28"/>
                 </w:rPr>
@@ -4158,6 +4261,7 @@
             <m:e>
               <m:r>
                 <w:rPr>
+                  <w:rFonts w:ascii="Cambria Math" w:hAnsi="Cambria Math"/>
                   <w:sz w:val="28"/>
                   <w:szCs w:val="28"/>
                 </w:rPr>
@@ -4167,6 +4271,7 @@
             <m:sub>
               <m:r>
                 <w:rPr>
+                  <w:rFonts w:ascii="Cambria Math" w:hAnsi="Cambria Math"/>
                   <w:sz w:val="28"/>
                   <w:szCs w:val="28"/>
                 </w:rPr>
@@ -4176,6 +4281,7 @@
           </m:sSub>
           <m:r>
             <w:rPr>
+              <w:rFonts w:ascii="Cambria Math" w:hAnsi="Cambria Math"/>
               <w:sz w:val="28"/>
               <w:szCs w:val="28"/>
             </w:rPr>
@@ -4185,6 +4291,7 @@
             <m:fPr>
               <m:ctrlPr>
                 <w:rPr>
+                  <w:rFonts w:ascii="Cambria Math" w:hAnsi="Cambria Math"/>
                   <w:sz w:val="28"/>
                   <w:szCs w:val="28"/>
                 </w:rPr>
@@ -4193,6 +4300,7 @@
             <m:num>
               <m:r>
                 <w:rPr>
+                  <w:rFonts w:ascii="Cambria Math" w:hAnsi="Cambria Math"/>
                   <w:sz w:val="28"/>
                   <w:szCs w:val="28"/>
                 </w:rPr>
@@ -4202,6 +4310,7 @@
             <m:den>
               <m:r>
                 <w:rPr>
+                  <w:rFonts w:ascii="Cambria Math" w:hAnsi="Cambria Math"/>
                   <w:sz w:val="28"/>
                   <w:szCs w:val="28"/>
                 </w:rPr>
@@ -4211,6 +4320,7 @@
           </m:f>
           <m:r>
             <w:rPr>
+              <w:rFonts w:ascii="Cambria Math" w:hAnsi="Cambria Math"/>
               <w:sz w:val="28"/>
               <w:szCs w:val="28"/>
             </w:rPr>
@@ -4222,6 +4332,7 @@
               <m:limLoc m:val="undOvr"/>
               <m:ctrlPr>
                 <w:rPr>
+                  <w:rFonts w:ascii="Cambria Math" w:hAnsi="Cambria Math"/>
                   <w:sz w:val="28"/>
                   <w:szCs w:val="28"/>
                 </w:rPr>
@@ -4230,6 +4341,7 @@
             <m:sub>
               <m:r>
                 <w:rPr>
+                  <w:rFonts w:ascii="Cambria Math" w:hAnsi="Cambria Math"/>
                   <w:sz w:val="28"/>
                   <w:szCs w:val="28"/>
                 </w:rPr>
@@ -4239,6 +4351,7 @@
             <m:sup>
               <m:r>
                 <w:rPr>
+                  <w:rFonts w:ascii="Cambria Math" w:hAnsi="Cambria Math"/>
                   <w:sz w:val="28"/>
                   <w:szCs w:val="28"/>
                 </w:rPr>
@@ -4248,6 +4361,7 @@
             <m:e>
               <m:r>
                 <w:rPr>
+                  <w:rFonts w:ascii="Cambria Math" w:hAnsi="Cambria Math"/>
                   <w:sz w:val="28"/>
                   <w:szCs w:val="28"/>
                 </w:rPr>
@@ -4257,6 +4371,7 @@
                 <m:sSubPr>
                   <m:ctrlPr>
                     <w:rPr>
+                      <w:rFonts w:ascii="Cambria Math" w:hAnsi="Cambria Math"/>
                       <w:sz w:val="28"/>
                       <w:szCs w:val="28"/>
                     </w:rPr>
@@ -4265,6 +4380,7 @@
                 <m:e>
                   <m:r>
                     <w:rPr>
+                      <w:rFonts w:ascii="Cambria Math" w:hAnsi="Cambria Math"/>
                       <w:sz w:val="28"/>
                       <w:szCs w:val="28"/>
                     </w:rPr>
@@ -4274,6 +4390,7 @@
                 <m:sub>
                   <m:r>
                     <w:rPr>
+                      <w:rFonts w:ascii="Cambria Math" w:hAnsi="Cambria Math"/>
                       <w:sz w:val="28"/>
                       <w:szCs w:val="28"/>
                     </w:rPr>
@@ -4283,6 +4400,7 @@
               </m:sSub>
               <m:r>
                 <w:rPr>
+                  <w:rFonts w:ascii="Cambria Math" w:hAnsi="Cambria Math"/>
                   <w:sz w:val="28"/>
                   <w:szCs w:val="28"/>
                 </w:rPr>
@@ -4322,6 +4440,7 @@
         <m:oMath>
           <m:r>
             <w:rPr>
+              <w:rFonts w:ascii="Cambria Math" w:hAnsi="Cambria Math"/>
               <w:sz w:val="28"/>
               <w:szCs w:val="28"/>
             </w:rPr>
@@ -4334,6 +4453,7 @@
               <m:endChr m:val=""/>
               <m:ctrlPr>
                 <w:rPr>
+                  <w:rFonts w:ascii="Cambria Math" w:hAnsi="Cambria Math"/>
                   <w:sz w:val="28"/>
                   <w:szCs w:val="28"/>
                 </w:rPr>
@@ -4344,6 +4464,7 @@
                 <m:eqArrPr>
                   <m:ctrlPr>
                     <w:rPr>
+                      <w:rFonts w:ascii="Cambria Math" w:hAnsi="Cambria Math"/>
                       <w:sz w:val="28"/>
                       <w:szCs w:val="28"/>
                     </w:rPr>
@@ -4352,6 +4473,7 @@
                 <m:e>
                   <m:r>
                     <w:rPr>
+                      <w:rFonts w:ascii="Cambria Math" w:hAnsi="Cambria Math"/>
                       <w:sz w:val="28"/>
                       <w:szCs w:val="28"/>
                     </w:rPr>
@@ -4361,6 +4483,7 @@
                 <m:e>
                   <m:r>
                     <w:rPr>
+                      <w:rFonts w:ascii="Cambria Math" w:hAnsi="Cambria Math"/>
                       <w:sz w:val="28"/>
                       <w:szCs w:val="28"/>
                     </w:rPr>
@@ -4554,6 +4677,7 @@
         <m:oMath>
           <m:r>
             <w:rPr>
+              <w:rFonts w:ascii="Cambria Math" w:hAnsi="Cambria Math"/>
               <w:sz w:val="28"/>
               <w:szCs w:val="28"/>
             </w:rPr>
@@ -4563,6 +4687,7 @@
             <m:dPr>
               <m:ctrlPr>
                 <w:rPr>
+                  <w:rFonts w:ascii="Cambria Math" w:hAnsi="Cambria Math"/>
                   <w:sz w:val="28"/>
                   <w:szCs w:val="28"/>
                 </w:rPr>
@@ -4573,6 +4698,7 @@
                 <m:funcPr>
                   <m:ctrlPr>
                     <w:rPr>
+                      <w:rFonts w:ascii="Cambria Math" w:hAnsi="Cambria Math"/>
                       <w:sz w:val="28"/>
                       <w:szCs w:val="28"/>
                     </w:rPr>
@@ -4581,6 +4707,7 @@
                 <m:fName>
                   <m:r>
                     <w:rPr>
+                      <w:rFonts w:ascii="Cambria Math" w:hAnsi="Cambria Math"/>
                       <w:sz w:val="28"/>
                       <w:szCs w:val="28"/>
                     </w:rPr>
@@ -4594,6 +4721,7 @@
                       <m:endChr m:val="|"/>
                       <m:ctrlPr>
                         <w:rPr>
+                          <w:rFonts w:ascii="Cambria Math" w:hAnsi="Cambria Math"/>
                           <w:sz w:val="28"/>
                           <w:szCs w:val="28"/>
                         </w:rPr>
@@ -4604,6 +4732,7 @@
                         <m:sSubPr>
                           <m:ctrlPr>
                             <w:rPr>
+                              <w:rFonts w:ascii="Cambria Math" w:hAnsi="Cambria Math"/>
                               <w:sz w:val="28"/>
                               <w:szCs w:val="28"/>
                             </w:rPr>
@@ -4612,6 +4741,7 @@
                         <m:e>
                           <m:r>
                             <w:rPr>
+                              <w:rFonts w:ascii="Cambria Math" w:hAnsi="Cambria Math"/>
                               <w:sz w:val="28"/>
                               <w:szCs w:val="28"/>
                             </w:rPr>
@@ -4621,6 +4751,7 @@
                         <m:sub>
                           <m:r>
                             <w:rPr>
+                              <w:rFonts w:ascii="Cambria Math" w:hAnsi="Cambria Math"/>
                               <w:sz w:val="28"/>
                               <w:szCs w:val="28"/>
                             </w:rPr>
@@ -4630,6 +4761,7 @@
                       </m:sSub>
                       <m:r>
                         <w:rPr>
+                          <w:rFonts w:ascii="Cambria Math" w:hAnsi="Cambria Math"/>
                           <w:sz w:val="28"/>
                           <w:szCs w:val="28"/>
                         </w:rPr>
@@ -4639,6 +4771,7 @@
                         <m:sSubPr>
                           <m:ctrlPr>
                             <w:rPr>
+                              <w:rFonts w:ascii="Cambria Math" w:hAnsi="Cambria Math"/>
                               <w:sz w:val="28"/>
                               <w:szCs w:val="28"/>
                             </w:rPr>
@@ -4647,6 +4780,7 @@
                         <m:e>
                           <m:r>
                             <w:rPr>
+                              <w:rFonts w:ascii="Cambria Math" w:hAnsi="Cambria Math"/>
                               <w:sz w:val="28"/>
                               <w:szCs w:val="28"/>
                             </w:rPr>
@@ -4656,6 +4790,7 @@
                         <m:sub>
                           <m:r>
                             <w:rPr>
+                              <w:rFonts w:ascii="Cambria Math" w:hAnsi="Cambria Math"/>
                               <w:sz w:val="28"/>
                               <w:szCs w:val="28"/>
                             </w:rPr>
@@ -4665,6 +4800,7 @@
                       </m:sSub>
                       <m:r>
                         <w:rPr>
+                          <w:rFonts w:ascii="Cambria Math" w:hAnsi="Cambria Math"/>
                           <w:sz w:val="28"/>
                           <w:szCs w:val="28"/>
                         </w:rPr>
@@ -4676,6 +4812,7 @@
               </m:func>
               <m:r>
                 <w:rPr>
+                  <w:rFonts w:ascii="Cambria Math" w:hAnsi="Cambria Math"/>
                   <w:sz w:val="28"/>
                   <w:szCs w:val="28"/>
                 </w:rPr>
@@ -4685,6 +4822,7 @@
           </m:d>
           <m:r>
             <w:rPr>
+              <w:rFonts w:ascii="Cambria Math" w:hAnsi="Cambria Math"/>
               <w:sz w:val="28"/>
               <w:szCs w:val="28"/>
             </w:rPr>
@@ -4837,6 +4975,7 @@
             <m:sSubPr>
               <m:ctrlPr>
                 <w:rPr>
+                  <w:rFonts w:ascii="Cambria Math" w:hAnsi="Cambria Math"/>
                   <w:sz w:val="28"/>
                   <w:szCs w:val="28"/>
                 </w:rPr>
@@ -4845,6 +4984,7 @@
             <m:e>
               <m:r>
                 <w:rPr>
+                  <w:rFonts w:ascii="Cambria Math" w:hAnsi="Cambria Math"/>
                   <w:sz w:val="28"/>
                   <w:szCs w:val="28"/>
                 </w:rPr>
@@ -4854,6 +4994,7 @@
             <m:sub>
               <m:r>
                 <w:rPr>
+                  <w:rFonts w:ascii="Cambria Math" w:hAnsi="Cambria Math"/>
                   <w:sz w:val="28"/>
                   <w:szCs w:val="28"/>
                 </w:rPr>
@@ -4863,6 +5004,7 @@
           </m:sSub>
           <m:r>
             <w:rPr>
+              <w:rFonts w:ascii="Cambria Math" w:hAnsi="Cambria Math"/>
               <w:sz w:val="28"/>
               <w:szCs w:val="28"/>
             </w:rPr>
@@ -4874,6 +5016,7 @@
               <m:endChr m:val=""/>
               <m:ctrlPr>
                 <w:rPr>
+                  <w:rFonts w:ascii="Cambria Math" w:hAnsi="Cambria Math"/>
                   <w:sz w:val="28"/>
                   <w:szCs w:val="28"/>
                 </w:rPr>
@@ -4884,6 +5027,7 @@
                 <m:eqArrPr>
                   <m:ctrlPr>
                     <w:rPr>
+                      <w:rFonts w:ascii="Cambria Math" w:hAnsi="Cambria Math"/>
                       <w:sz w:val="28"/>
                       <w:szCs w:val="28"/>
                     </w:rPr>
@@ -4892,6 +5036,7 @@
                 <m:e>
                   <m:r>
                     <w:rPr>
+                      <w:rFonts w:ascii="Cambria Math" w:hAnsi="Cambria Math"/>
                       <w:sz w:val="28"/>
                       <w:szCs w:val="28"/>
                     </w:rPr>
@@ -4899,6 +5044,7 @@
                   </m:r>
                   <m:r>
                     <w:rPr>
+                      <w:rFonts w:ascii="Cambria Math" w:hAnsi="Cambria Math"/>
                       <w:sz w:val="28"/>
                       <w:szCs w:val="28"/>
                       <w:lang w:val="en-US"/>
@@ -4909,6 +5055,7 @@
                 <m:e>
                   <m:r>
                     <w:rPr>
+                      <w:rFonts w:ascii="Cambria Math" w:hAnsi="Cambria Math"/>
                       <w:sz w:val="28"/>
                       <w:szCs w:val="28"/>
                     </w:rPr>
@@ -4918,6 +5065,7 @@
                 <m:e>
                   <m:r>
                     <w:rPr>
+                      <w:rFonts w:ascii="Cambria Math" w:hAnsi="Cambria Math"/>
                       <w:sz w:val="28"/>
                       <w:szCs w:val="28"/>
                     </w:rPr>
@@ -4925,6 +5073,7 @@
                   </m:r>
                   <m:r>
                     <w:rPr>
+                      <w:rFonts w:ascii="Cambria Math" w:hAnsi="Cambria Math"/>
                       <w:sz w:val="28"/>
                       <w:szCs w:val="28"/>
                       <w:lang w:val="en-US"/>
@@ -5644,7 +5793,23 @@
           <w:szCs w:val="28"/>
         </w:rPr>
         <w:tab/>
-        <w:t>Гладкая, без резких скачков, форма кривой характерна для параметра формы α &gt; 1 (при α ≤ 1 плотность была бы J-образной).</w:t>
+        <w:t xml:space="preserve">Гладкая, без резких скачков, форма кривой характерна для параметра формы </w:t>
+      </w:r>
+      <w:proofErr w:type="gramStart"/>
+      <w:r>
+        <w:rPr>
+          <w:sz w:val="28"/>
+          <w:szCs w:val="28"/>
+        </w:rPr>
+        <w:t>α &gt;</w:t>
+      </w:r>
+      <w:proofErr w:type="gramEnd"/>
+      <w:r>
+        <w:rPr>
+          <w:sz w:val="28"/>
+          <w:szCs w:val="28"/>
+        </w:rPr>
+        <w:t> 1 (при α ≤ 1 плотность была бы J-образной).</w:t>
       </w:r>
     </w:p>
     <w:p>
@@ -5936,6 +6101,7 @@
           <m:sSubPr>
             <m:ctrlPr>
               <w:rPr>
+                <w:rFonts w:ascii="Cambria Math" w:hAnsi="Cambria Math"/>
                 <w:sz w:val="28"/>
                 <w:szCs w:val="28"/>
               </w:rPr>
@@ -5944,6 +6110,7 @@
           <m:e>
             <m:r>
               <w:rPr>
+                <w:rFonts w:ascii="Cambria Math" w:hAnsi="Cambria Math"/>
                 <w:sz w:val="28"/>
                 <w:szCs w:val="28"/>
               </w:rPr>
@@ -5953,6 +6120,7 @@
           <m:sub>
             <m:r>
               <w:rPr>
+                <w:rFonts w:ascii="Cambria Math" w:hAnsi="Cambria Math"/>
                 <w:sz w:val="28"/>
                 <w:szCs w:val="28"/>
               </w:rPr>
@@ -5962,6 +6130,7 @@
         </m:sSub>
         <m:r>
           <w:rPr>
+            <w:rFonts w:ascii="Cambria Math" w:hAnsi="Cambria Math"/>
             <w:sz w:val="28"/>
             <w:szCs w:val="28"/>
           </w:rPr>
@@ -5971,6 +6140,7 @@
           <m:fPr>
             <m:ctrlPr>
               <w:rPr>
+                <w:rFonts w:ascii="Cambria Math" w:hAnsi="Cambria Math"/>
                 <w:sz w:val="28"/>
                 <w:szCs w:val="28"/>
               </w:rPr>
@@ -5981,6 +6151,7 @@
               <m:sSubPr>
                 <m:ctrlPr>
                   <w:rPr>
+                    <w:rFonts w:ascii="Cambria Math" w:hAnsi="Cambria Math"/>
                     <w:sz w:val="28"/>
                     <w:szCs w:val="28"/>
                   </w:rPr>
@@ -5989,6 +6160,7 @@
               <m:e>
                 <m:r>
                   <w:rPr>
+                    <w:rFonts w:ascii="Cambria Math" w:hAnsi="Cambria Math"/>
                     <w:sz w:val="28"/>
                     <w:szCs w:val="28"/>
                   </w:rPr>
@@ -5998,6 +6170,7 @@
               <m:sub>
                 <m:r>
                   <w:rPr>
+                    <w:rFonts w:ascii="Cambria Math" w:hAnsi="Cambria Math"/>
                     <w:sz w:val="28"/>
                     <w:szCs w:val="28"/>
                   </w:rPr>
@@ -6009,6 +6182,7 @@
           <m:den>
             <m:r>
               <w:rPr>
+                <w:rFonts w:ascii="Cambria Math" w:hAnsi="Cambria Math"/>
                 <w:sz w:val="28"/>
                 <w:szCs w:val="28"/>
               </w:rPr>
@@ -7175,7 +7349,7 @@
     <w:p>
       <w:pPr>
         <w:spacing w:line="360" w:lineRule="auto"/>
-        <w:ind w:firstLine="720"/>
+        <w:ind w:firstLine="360"/>
         <w:jc w:val="both"/>
         <w:rPr>
           <w:sz w:val="28"/>
@@ -7196,7 +7370,52 @@
           <w:sz w:val="28"/>
           <w:szCs w:val="28"/>
         </w:rPr>
-        <w:t>. Гистограмма имеет отчётливую двугорбую (бимодальную) форму, характерную для двойного гамма-распределения при параметре формы α &gt; 1. Два пика симметрично расположены относительно параметра смещения: левый пик — вблизи x ≈ −4,2, правый — вблизи x ≈ 6,5. Из этих значений можно получить приближённые оценки параметров:</w:t>
+        <w:t xml:space="preserve">. Гистограмма имеет отчётливую двугорбую (бимодальную) форму, характерную для двойного гамма-распределения при параметре формы </w:t>
+      </w:r>
+      <w:proofErr w:type="gramStart"/>
+      <w:r>
+        <w:rPr>
+          <w:sz w:val="28"/>
+          <w:szCs w:val="28"/>
+        </w:rPr>
+        <w:t>α &gt;</w:t>
+      </w:r>
+      <w:proofErr w:type="gramEnd"/>
+      <w:r>
+        <w:rPr>
+          <w:sz w:val="28"/>
+          <w:szCs w:val="28"/>
+        </w:rPr>
+        <w:t> 1.</w:t>
+      </w:r>
+      <w:r>
+        <w:rPr>
+          <w:sz w:val="28"/>
+          <w:szCs w:val="28"/>
+        </w:rPr>
+        <w:t xml:space="preserve"> В данном варианте требуется рассмотреть параметр формы и параметр смещения, поэтому при анализе гистограммы примем параметр масштаба β = 1.</w:t>
+      </w:r>
+      <w:r>
+        <w:rPr>
+          <w:sz w:val="28"/>
+          <w:szCs w:val="28"/>
+        </w:rPr>
+        <w:t xml:space="preserve"> </w:t>
+      </w:r>
+      <w:r>
+        <w:rPr>
+          <w:sz w:val="28"/>
+          <w:szCs w:val="28"/>
+        </w:rPr>
+        <w:t xml:space="preserve">Два пика симметрично расположены относительно параметра смещения: левый пик — вблизи </w:t>
+      </w:r>
+      <w:r>
+        <w:rPr>
+          <w:sz w:val="28"/>
+          <w:szCs w:val="28"/>
+        </w:rPr>
+        <w:lastRenderedPageBreak/>
+        <w:t>x ≈ −4,2, правый — вблизи x ≈ 6,5. Из этих значений можно получить приближённые оценки параметров:</w:t>
       </w:r>
     </w:p>
     <w:p>
@@ -7258,7 +7477,49 @@
           <w:szCs w:val="28"/>
         </w:rPr>
         <w:tab/>
-        <w:t>Расстояние от пика до loc определяется как (α − 1) / β; с учётом оценки β ≈ 1,1: α − 1 ≈ (6,5 − 1,15) × 1,1 ≈ 5,9, то есть α ≈ 7.</w:t>
+        <w:t>Расстояние от пика до loc определяется как (α − 1) / </w:t>
+      </w:r>
+      <w:r>
+        <w:rPr>
+          <w:sz w:val="28"/>
+          <w:szCs w:val="28"/>
+        </w:rPr>
+        <w:t>β</w:t>
+      </w:r>
+      <w:r>
+        <w:rPr>
+          <w:sz w:val="28"/>
+          <w:szCs w:val="28"/>
+        </w:rPr>
+        <w:t>; с учётом оценки: α − 1 ≈ (6,5 − 1,15) × 1 ≈ 5,</w:t>
+      </w:r>
+      <w:r>
+        <w:rPr>
+          <w:sz w:val="28"/>
+          <w:szCs w:val="28"/>
+        </w:rPr>
+        <w:t>35</w:t>
+      </w:r>
+      <w:r>
+        <w:rPr>
+          <w:sz w:val="28"/>
+          <w:szCs w:val="28"/>
+        </w:rPr>
+        <w:t>, то есть α ≈ </w:t>
+      </w:r>
+      <w:r>
+        <w:rPr>
+          <w:sz w:val="28"/>
+          <w:szCs w:val="28"/>
+        </w:rPr>
+        <w:t>6,35</w:t>
+      </w:r>
+      <w:r>
+        <w:rPr>
+          <w:sz w:val="28"/>
+          <w:szCs w:val="28"/>
+        </w:rPr>
+        <w:t>.</w:t>
       </w:r>
     </w:p>
     <w:p>
@@ -7286,7 +7547,63 @@
           <w:sz w:val="28"/>
           <w:szCs w:val="28"/>
         </w:rPr>
-        <w:t xml:space="preserve">Таким образом, по гистограмме полной выборки получены предварительные оценки: α ≈ 7, β ≈ 1,1, loc ≈ 1,2. </w:t>
+        <w:t>Таким образом, по гистограмме полной выборки получены предварительные оценки: α ≈ </w:t>
+      </w:r>
+      <w:r>
+        <w:rPr>
+          <w:sz w:val="28"/>
+          <w:szCs w:val="28"/>
+        </w:rPr>
+        <w:t>6,35</w:t>
+      </w:r>
+      <w:r>
+        <w:rPr>
+          <w:sz w:val="28"/>
+          <w:szCs w:val="28"/>
+        </w:rPr>
+        <w:t>, β </w:t>
+      </w:r>
+      <w:r>
+        <w:rPr>
+          <w:sz w:val="28"/>
+          <w:szCs w:val="28"/>
+        </w:rPr>
+        <w:t>=</w:t>
+      </w:r>
+      <w:r>
+        <w:rPr>
+          <w:sz w:val="28"/>
+          <w:szCs w:val="28"/>
+        </w:rPr>
+        <w:t> </w:t>
+      </w:r>
+      <w:r>
+        <w:rPr>
+          <w:sz w:val="28"/>
+          <w:szCs w:val="28"/>
+        </w:rPr>
+        <w:t>1</w:t>
+      </w:r>
+      <w:r>
+        <w:rPr>
+          <w:sz w:val="28"/>
+          <w:szCs w:val="28"/>
+        </w:rPr>
+        <w:t>, loc ≈ 1,</w:t>
+      </w:r>
+      <w:r>
+        <w:rPr>
+          <w:sz w:val="28"/>
+          <w:szCs w:val="28"/>
+        </w:rPr>
+        <w:t>15</w:t>
+      </w:r>
+      <w:r>
+        <w:rPr>
+          <w:sz w:val="28"/>
+          <w:szCs w:val="28"/>
+        </w:rPr>
+        <w:t xml:space="preserve">. </w:t>
       </w:r>
     </w:p>
     <w:p>
@@ -7480,45 +7797,44 @@
     </w:p>
     <w:p>
       <w:pPr>
-        <w:spacing w:line="360" w:lineRule="auto"/>
-        <w:jc w:val="both"/>
-        <w:rPr>
-          <w:sz w:val="28"/>
-          <w:szCs w:val="28"/>
-        </w:rPr>
-      </w:pPr>
-    </w:p>
-    <w:p>
-      <w:pPr>
+        <w:pStyle w:val="a7"/>
+        <w:numPr>
+          <w:ilvl w:val="0"/>
+          <w:numId w:val="3"/>
+        </w:numPr>
         <w:spacing w:line="360" w:lineRule="auto"/>
         <w:jc w:val="center"/>
         <w:rPr>
           <w:b/>
           <w:bCs/>
-          <w:sz w:val="28"/>
-          <w:szCs w:val="28"/>
-          <w:lang w:val="en-US"/>
+          <w:sz w:val="32"/>
+          <w:szCs w:val="32"/>
         </w:rPr>
       </w:pPr>
       <w:r>
         <w:rPr>
           <w:b/>
           <w:bCs/>
-          <w:sz w:val="28"/>
-          <w:szCs w:val="28"/>
-        </w:rPr>
-        <w:t>Список</w:t>
-      </w:r>
-      <w:r>
+          <w:sz w:val="32"/>
+          <w:szCs w:val="32"/>
+        </w:rPr>
+        <w:t>Описание параметров распределения</w:t>
+      </w:r>
+    </w:p>
+    <w:p>
+      <w:pPr>
+        <w:pStyle w:val="a7"/>
+        <w:numPr>
+          <w:ilvl w:val="1"/>
+          <w:numId w:val="3"/>
+        </w:numPr>
         <w:rPr>
           <w:b/>
           <w:bCs/>
           <w:sz w:val="28"/>
           <w:szCs w:val="28"/>
-          <w:lang w:val="en-US"/>
-        </w:rPr>
-        <w:t xml:space="preserve"> </w:t>
-      </w:r>
+        </w:rPr>
+      </w:pPr>
       <w:r>
         <w:rPr>
           <w:b/>
@@ -7526,70 +7842,1557 @@
           <w:sz w:val="28"/>
           <w:szCs w:val="28"/>
         </w:rPr>
-        <w:t>использованной</w:t>
-      </w:r>
-      <w:r>
+        <w:t xml:space="preserve">Определить вид теоретической функции распределения из варианта, включающей в себя все заданные в варианте параметры. </w:t>
+      </w:r>
+    </w:p>
+    <w:p>
+      <w:pPr>
+        <w:ind w:left="360"/>
         <w:rPr>
           <w:b/>
           <w:bCs/>
           <w:sz w:val="28"/>
           <w:szCs w:val="28"/>
-          <w:lang w:val="en-US"/>
+        </w:rPr>
+      </w:pPr>
+    </w:p>
+    <w:p>
+      <w:pPr>
+        <w:spacing w:line="360" w:lineRule="auto"/>
+        <w:ind w:firstLine="360"/>
+        <w:jc w:val="both"/>
+        <w:rPr>
+          <w:sz w:val="28"/>
+          <w:szCs w:val="28"/>
+        </w:rPr>
+      </w:pPr>
+      <w:r>
+        <w:rPr>
+          <w:sz w:val="28"/>
+          <w:szCs w:val="28"/>
+        </w:rPr>
+        <w:t xml:space="preserve">Двойное гамма распределение </w:t>
+      </w:r>
+      <w:r>
+        <w:rPr>
+          <w:sz w:val="28"/>
+          <w:szCs w:val="28"/>
+        </w:rPr>
+        <w:t xml:space="preserve">имеет три параметра: </w:t>
+      </w:r>
+      <m:oMath>
+        <m:r>
+          <w:rPr>
+            <w:rFonts w:ascii="Cambria Math" w:hAnsi="Cambria Math"/>
+            <w:sz w:val="28"/>
+            <w:szCs w:val="28"/>
+          </w:rPr>
+          <m:t>μ</m:t>
+        </m:r>
+      </m:oMath>
+      <w:r>
+        <w:rPr>
+          <w:sz w:val="28"/>
+          <w:szCs w:val="28"/>
+        </w:rPr>
+        <w:t xml:space="preserve">, </w:t>
+      </w:r>
+      <m:oMath>
+        <m:r>
+          <w:rPr>
+            <w:rFonts w:ascii="Cambria Math" w:hAnsi="Cambria Math"/>
+            <w:sz w:val="28"/>
+            <w:szCs w:val="28"/>
+          </w:rPr>
+          <m:t>β</m:t>
+        </m:r>
+      </m:oMath>
+      <w:r>
+        <w:rPr>
+          <w:sz w:val="28"/>
+          <w:szCs w:val="28"/>
         </w:rPr>
         <w:t xml:space="preserve"> </w:t>
       </w:r>
       <w:r>
+        <w:rPr>
+          <w:sz w:val="28"/>
+          <w:szCs w:val="28"/>
+        </w:rPr>
+        <w:t xml:space="preserve">и </w:t>
+      </w:r>
+      <m:oMath>
+        <m:r>
+          <w:rPr>
+            <w:rFonts w:ascii="Cambria Math" w:hAnsi="Cambria Math"/>
+            <w:sz w:val="28"/>
+            <w:szCs w:val="28"/>
+          </w:rPr>
+          <m:t>γ</m:t>
+        </m:r>
+      </m:oMath>
+      <w:r>
+        <w:rPr>
+          <w:sz w:val="28"/>
+          <w:szCs w:val="28"/>
+        </w:rPr>
+        <w:t>, которые соответствуют параметрам смещения, масштаба и концентрации (также называемому параметром формы).</w:t>
+      </w:r>
+      <w:r>
+        <w:rPr>
+          <w:sz w:val="28"/>
+          <w:szCs w:val="28"/>
+        </w:rPr>
+        <w:t xml:space="preserve"> </w:t>
+      </w:r>
+      <w:r>
+        <w:rPr>
+          <w:sz w:val="28"/>
+          <w:szCs w:val="28"/>
+        </w:rPr>
+        <w:t>[5]</w:t>
+      </w:r>
+      <w:r>
+        <w:rPr>
+          <w:sz w:val="28"/>
+          <w:szCs w:val="28"/>
+        </w:rPr>
+        <w:t xml:space="preserve"> </w:t>
+      </w:r>
+    </w:p>
+    <w:p>
+      <w:pPr>
+        <w:spacing w:line="360" w:lineRule="auto"/>
+        <w:ind w:firstLine="360"/>
+        <w:jc w:val="both"/>
+        <w:rPr>
+          <w:sz w:val="28"/>
+          <w:szCs w:val="28"/>
+        </w:rPr>
+      </w:pPr>
+      <w:r>
+        <w:rPr>
+          <w:sz w:val="28"/>
+          <w:szCs w:val="28"/>
+        </w:rPr>
+        <w:t>Исходя из результатов, полученных в предыдущих пунктах:</w:t>
+      </w:r>
+    </w:p>
+    <w:p>
+      <w:pPr>
+        <w:spacing w:line="360" w:lineRule="auto"/>
+        <w:ind w:left="12" w:firstLine="348"/>
+        <w:jc w:val="both"/>
+        <w:rPr>
+          <w:sz w:val="28"/>
+          <w:szCs w:val="28"/>
+        </w:rPr>
+      </w:pPr>
+      <w:r>
+        <w:rPr>
+          <w:sz w:val="28"/>
+          <w:szCs w:val="28"/>
+        </w:rPr>
+        <w:t>–</w:t>
+      </w:r>
+      <w:r>
+        <w:rPr>
+          <w:sz w:val="28"/>
+          <w:szCs w:val="28"/>
+        </w:rPr>
+        <w:tab/>
+      </w:r>
+      <w:r>
+        <w:rPr>
+          <w:sz w:val="28"/>
+          <w:szCs w:val="28"/>
+        </w:rPr>
+        <w:t>Параметр смещения</w:t>
+      </w:r>
+      <w:r>
+        <w:rPr>
+          <w:sz w:val="28"/>
+          <w:szCs w:val="28"/>
+        </w:rPr>
+        <w:t xml:space="preserve"> </w:t>
+      </w:r>
+      <w:r>
+        <w:rPr>
+          <w:sz w:val="28"/>
+          <w:szCs w:val="28"/>
+        </w:rPr>
+        <w:t>loc ≈ 1,2</w:t>
+      </w:r>
+      <w:r>
+        <w:rPr>
+          <w:sz w:val="28"/>
+          <w:szCs w:val="28"/>
+        </w:rPr>
+        <w:t>;</w:t>
+      </w:r>
+    </w:p>
+    <w:p>
+      <w:pPr>
+        <w:spacing w:line="360" w:lineRule="auto"/>
+        <w:ind w:firstLine="360"/>
+        <w:jc w:val="both"/>
+        <w:rPr>
+          <w:sz w:val="28"/>
+          <w:szCs w:val="28"/>
+        </w:rPr>
+      </w:pPr>
+      <w:r>
+        <w:rPr>
+          <w:sz w:val="28"/>
+          <w:szCs w:val="28"/>
+        </w:rPr>
+        <w:t>–</w:t>
+      </w:r>
+      <w:r>
+        <w:rPr>
+          <w:sz w:val="28"/>
+          <w:szCs w:val="28"/>
+        </w:rPr>
+        <w:tab/>
+      </w:r>
+      <w:r>
+        <w:rPr>
+          <w:sz w:val="28"/>
+          <w:szCs w:val="28"/>
+        </w:rPr>
+        <w:t>Параметр формы</w:t>
+      </w:r>
+      <w:r>
+        <w:rPr>
+          <w:sz w:val="28"/>
+          <w:szCs w:val="28"/>
+        </w:rPr>
+        <w:t xml:space="preserve"> α ≈ 6,35.</w:t>
+      </w:r>
+    </w:p>
+    <w:p>
+      <w:pPr>
+        <w:spacing w:line="360" w:lineRule="auto"/>
+        <w:ind w:firstLine="360"/>
+        <w:jc w:val="both"/>
+        <w:rPr>
+          <w:sz w:val="28"/>
+          <w:szCs w:val="28"/>
+        </w:rPr>
+      </w:pPr>
+      <w:r>
+        <w:rPr>
+          <w:sz w:val="28"/>
+          <w:szCs w:val="28"/>
+        </w:rPr>
+        <w:t>–</w:t>
+      </w:r>
+      <w:r>
+        <w:rPr>
+          <w:sz w:val="28"/>
+          <w:szCs w:val="28"/>
+        </w:rPr>
+        <w:tab/>
+        <w:t>Параметр масштаба</w:t>
+      </w:r>
+      <w:r>
+        <w:rPr>
+          <w:sz w:val="28"/>
+          <w:szCs w:val="28"/>
+        </w:rPr>
+        <w:t xml:space="preserve"> </w:t>
+      </w:r>
+      <w:r>
+        <w:rPr>
+          <w:sz w:val="28"/>
+          <w:szCs w:val="28"/>
+        </w:rPr>
+        <w:t>β = 1</w:t>
+      </w:r>
+      <w:r>
+        <w:rPr>
+          <w:sz w:val="28"/>
+          <w:szCs w:val="28"/>
+        </w:rPr>
+        <w:t>.</w:t>
+      </w:r>
+    </w:p>
+    <w:p>
+      <w:pPr>
+        <w:spacing w:line="360" w:lineRule="auto"/>
+        <w:ind w:firstLine="360"/>
+        <w:jc w:val="both"/>
+        <w:rPr>
+          <w:sz w:val="28"/>
+          <w:szCs w:val="28"/>
+        </w:rPr>
+      </w:pPr>
+      <w:r>
+        <w:rPr>
+          <w:noProof/>
+          <w:sz w:val="28"/>
+          <w:szCs w:val="28"/>
+        </w:rPr>
+        <w:drawing>
+          <wp:inline distT="0" distB="0" distL="0" distR="0" wp14:anchorId="02320914" wp14:editId="5492FB7D">
+            <wp:extent cx="3019846" cy="733527"/>
+            <wp:effectExtent l="0" t="0" r="9525" b="9525"/>
+            <wp:docPr id="1461414313" name="Рисунок 1"/>
+            <wp:cNvGraphicFramePr>
+              <a:graphicFrameLocks xmlns:a="http://schemas.openxmlformats.org/drawingml/2006/main" noChangeAspect="1"/>
+            </wp:cNvGraphicFramePr>
+            <a:graphic xmlns:a="http://schemas.openxmlformats.org/drawingml/2006/main">
+              <a:graphicData uri="http://schemas.openxmlformats.org/drawingml/2006/picture">
+                <pic:pic xmlns:pic="http://schemas.openxmlformats.org/drawingml/2006/picture">
+                  <pic:nvPicPr>
+                    <pic:cNvPr id="1461414313" name=""/>
+                    <pic:cNvPicPr/>
+                  </pic:nvPicPr>
+                  <pic:blipFill>
+                    <a:blip r:embed="rId26"/>
+                    <a:stretch>
+                      <a:fillRect/>
+                    </a:stretch>
+                  </pic:blipFill>
+                  <pic:spPr>
+                    <a:xfrm>
+                      <a:off x="0" y="0"/>
+                      <a:ext cx="3019846" cy="733527"/>
+                    </a:xfrm>
+                    <a:prstGeom prst="rect">
+                      <a:avLst/>
+                    </a:prstGeom>
+                  </pic:spPr>
+                </pic:pic>
+              </a:graphicData>
+            </a:graphic>
+          </wp:inline>
+        </w:drawing>
+      </w:r>
+    </w:p>
+    <w:p>
+      <w:pPr>
+        <w:spacing w:line="360" w:lineRule="auto"/>
+        <w:ind w:firstLine="360"/>
+        <w:jc w:val="both"/>
+        <w:rPr>
+          <w:sz w:val="28"/>
+          <w:szCs w:val="28"/>
+        </w:rPr>
+      </w:pPr>
+    </w:p>
+    <w:p>
+      <w:pPr>
+        <w:pStyle w:val="a7"/>
+        <w:numPr>
+          <w:ilvl w:val="1"/>
+          <w:numId w:val="3"/>
+        </w:numPr>
         <w:rPr>
           <w:b/>
           <w:bCs/>
           <w:sz w:val="28"/>
           <w:szCs w:val="28"/>
         </w:rPr>
-        <w:t>литературы</w:t>
-      </w:r>
-    </w:p>
-    <w:p>
-      <w:pPr>
-        <w:spacing w:line="360" w:lineRule="auto"/>
-        <w:jc w:val="center"/>
+      </w:pPr>
+      <w:r>
         <w:rPr>
           <w:b/>
           <w:bCs/>
           <w:sz w:val="28"/>
           <w:szCs w:val="28"/>
-          <w:lang w:val="en-US"/>
-        </w:rPr>
-      </w:pPr>
-    </w:p>
-    <w:p>
-      <w:pPr>
-        <w:spacing w:line="360" w:lineRule="auto"/>
-        <w:jc w:val="both"/>
-        <w:rPr>
-          <w:sz w:val="28"/>
-          <w:szCs w:val="28"/>
-          <w:lang w:val="en-US"/>
-        </w:rPr>
-      </w:pPr>
-      <w:r>
+        </w:rPr>
+        <w:t>Описание каждого из параметров распределения.</w:t>
+      </w:r>
+    </w:p>
+    <w:p>
+      <w:pPr>
+        <w:spacing w:line="360" w:lineRule="auto"/>
+        <w:ind w:firstLine="360"/>
+        <w:jc w:val="both"/>
+        <w:rPr>
+          <w:sz w:val="28"/>
+          <w:szCs w:val="28"/>
+        </w:rPr>
+      </w:pPr>
+    </w:p>
+    <w:p>
+      <w:pPr>
+        <w:spacing w:line="360" w:lineRule="auto"/>
+        <w:ind w:firstLine="360"/>
+        <w:jc w:val="both"/>
         <w:rPr>
           <w:b/>
           <w:bCs/>
           <w:sz w:val="28"/>
           <w:szCs w:val="28"/>
+        </w:rPr>
+      </w:pPr>
+      <w:r>
+        <w:rPr>
+          <w:b/>
+          <w:bCs/>
+          <w:sz w:val="28"/>
+          <w:szCs w:val="28"/>
+        </w:rPr>
+        <w:t>α — параметр формы</w:t>
+      </w:r>
+    </w:p>
+    <w:p>
+      <w:pPr>
+        <w:spacing w:line="360" w:lineRule="auto"/>
+        <w:ind w:firstLine="360"/>
+        <w:jc w:val="both"/>
+        <w:rPr>
+          <w:sz w:val="28"/>
+          <w:szCs w:val="28"/>
+        </w:rPr>
+      </w:pPr>
+      <w:r>
+        <w:rPr>
+          <w:sz w:val="28"/>
+          <w:szCs w:val="28"/>
+        </w:rPr>
+        <w:t xml:space="preserve">Отвечает за </w:t>
+      </w:r>
+      <w:r>
+        <w:rPr>
+          <w:b/>
+          <w:bCs/>
+          <w:sz w:val="28"/>
+          <w:szCs w:val="28"/>
+        </w:rPr>
+        <w:t>форму кривой</w:t>
+      </w:r>
+      <w:r>
+        <w:rPr>
+          <w:sz w:val="28"/>
+          <w:szCs w:val="28"/>
+        </w:rPr>
+        <w:t xml:space="preserve"> и </w:t>
+      </w:r>
+      <w:r>
+        <w:rPr>
+          <w:b/>
+          <w:bCs/>
+          <w:sz w:val="28"/>
+          <w:szCs w:val="28"/>
+        </w:rPr>
+        <w:t>расстояние между пиками</w:t>
+      </w:r>
+      <w:r>
+        <w:rPr>
+          <w:sz w:val="28"/>
+          <w:szCs w:val="28"/>
+        </w:rPr>
+        <w:t>.</w:t>
+      </w:r>
+    </w:p>
+    <w:p>
+      <w:pPr>
+        <w:numPr>
+          <w:ilvl w:val="0"/>
+          <w:numId w:val="9"/>
+        </w:numPr>
+        <w:spacing w:line="360" w:lineRule="auto"/>
+        <w:jc w:val="both"/>
+        <w:rPr>
+          <w:sz w:val="28"/>
+          <w:szCs w:val="28"/>
+        </w:rPr>
+      </w:pPr>
+      <w:r>
+        <w:rPr>
+          <w:sz w:val="28"/>
+          <w:szCs w:val="28"/>
+        </w:rPr>
+        <w:t xml:space="preserve">При </w:t>
+      </w:r>
+      <w:proofErr w:type="gramStart"/>
+      <w:r>
+        <w:rPr>
+          <w:sz w:val="28"/>
+          <w:szCs w:val="28"/>
+        </w:rPr>
+        <w:t>α&lt;</w:t>
+      </w:r>
+      <w:proofErr w:type="gramEnd"/>
+      <w:r>
+        <w:rPr>
+          <w:sz w:val="28"/>
+          <w:szCs w:val="28"/>
+        </w:rPr>
+        <w:t>1 — один острый пик в точке μ</w:t>
+      </w:r>
+      <w:r>
+        <w:rPr>
+          <w:sz w:val="28"/>
+          <w:szCs w:val="28"/>
+        </w:rPr>
+        <w:t>.</w:t>
+      </w:r>
+    </w:p>
+    <w:p>
+      <w:pPr>
+        <w:numPr>
+          <w:ilvl w:val="0"/>
+          <w:numId w:val="9"/>
+        </w:numPr>
+        <w:spacing w:line="360" w:lineRule="auto"/>
+        <w:jc w:val="both"/>
+        <w:rPr>
+          <w:sz w:val="28"/>
+          <w:szCs w:val="28"/>
+        </w:rPr>
+      </w:pPr>
+      <w:r>
+        <w:rPr>
+          <w:sz w:val="28"/>
+          <w:szCs w:val="28"/>
+        </w:rPr>
+        <w:t>При α=1 — вырождается в двустороннее экспоненциальное (Лапласово) распределение</w:t>
+      </w:r>
+    </w:p>
+    <w:p>
+      <w:pPr>
+        <w:numPr>
+          <w:ilvl w:val="0"/>
+          <w:numId w:val="9"/>
+        </w:numPr>
+        <w:spacing w:line="360" w:lineRule="auto"/>
+        <w:jc w:val="both"/>
+        <w:rPr>
+          <w:sz w:val="28"/>
+          <w:szCs w:val="28"/>
+        </w:rPr>
+      </w:pPr>
+      <w:r>
+        <w:rPr>
+          <w:sz w:val="28"/>
+          <w:szCs w:val="28"/>
+        </w:rPr>
+        <w:t xml:space="preserve">При α&gt;1 — появляются </w:t>
+      </w:r>
+      <w:r>
+        <w:rPr>
+          <w:b/>
+          <w:bCs/>
+          <w:sz w:val="28"/>
+          <w:szCs w:val="28"/>
+        </w:rPr>
+        <w:t>два симметричных пика</w:t>
+      </w:r>
+      <w:r>
+        <w:rPr>
+          <w:sz w:val="28"/>
+          <w:szCs w:val="28"/>
+        </w:rPr>
+        <w:t xml:space="preserve"> по обе стороны от μ</w:t>
+      </w:r>
+      <w:r>
+        <w:rPr>
+          <w:sz w:val="28"/>
+          <w:szCs w:val="28"/>
+        </w:rPr>
+        <w:t>.</w:t>
+      </w:r>
+    </w:p>
+    <w:p>
+      <w:pPr>
+        <w:numPr>
+          <w:ilvl w:val="0"/>
+          <w:numId w:val="9"/>
+        </w:numPr>
+        <w:spacing w:line="360" w:lineRule="auto"/>
+        <w:jc w:val="both"/>
+        <w:rPr>
+          <w:sz w:val="28"/>
+          <w:szCs w:val="28"/>
+        </w:rPr>
+      </w:pPr>
+      <w:r>
+        <w:rPr>
+          <w:sz w:val="28"/>
+          <w:szCs w:val="28"/>
+        </w:rPr>
+        <w:t>Чем больше α— тем дальше пики от центра и тем более они выражены</w:t>
+      </w:r>
+      <w:r>
+        <w:rPr>
+          <w:sz w:val="28"/>
+          <w:szCs w:val="28"/>
+        </w:rPr>
+        <w:br/>
+        <w:t>Моды находятся в точках μ±(α−</w:t>
+      </w:r>
+      <w:proofErr w:type="gramStart"/>
+      <w:r>
+        <w:rPr>
+          <w:sz w:val="28"/>
+          <w:szCs w:val="28"/>
+        </w:rPr>
+        <w:t>1)β</w:t>
+      </w:r>
+      <w:proofErr w:type="gramEnd"/>
+      <w:r>
+        <w:rPr>
+          <w:sz w:val="28"/>
+          <w:szCs w:val="28"/>
+        </w:rPr>
+        <w:t>, поэтому αнапрямую определяет, насколько далеко пики от центра.</w:t>
+      </w:r>
+    </w:p>
+    <w:p>
+      <w:pPr>
+        <w:spacing w:line="360" w:lineRule="auto"/>
+        <w:ind w:firstLine="360"/>
+        <w:jc w:val="both"/>
+        <w:rPr>
+          <w:b/>
+          <w:bCs/>
+          <w:sz w:val="28"/>
+          <w:szCs w:val="28"/>
+        </w:rPr>
+      </w:pPr>
+      <w:r>
+        <w:rPr>
+          <w:b/>
+          <w:bCs/>
+          <w:sz w:val="28"/>
+          <w:szCs w:val="28"/>
+        </w:rPr>
+        <w:t>μ — параметр смещения</w:t>
+      </w:r>
+    </w:p>
+    <w:p>
+      <w:pPr>
+        <w:spacing w:line="360" w:lineRule="auto"/>
+        <w:ind w:firstLine="360"/>
+        <w:jc w:val="both"/>
+        <w:rPr>
+          <w:sz w:val="28"/>
+          <w:szCs w:val="28"/>
+        </w:rPr>
+      </w:pPr>
+      <w:r>
+        <w:rPr>
+          <w:sz w:val="28"/>
+          <w:szCs w:val="28"/>
+        </w:rPr>
+        <w:t xml:space="preserve">Отвечает за </w:t>
+      </w:r>
+      <w:r>
+        <w:rPr>
+          <w:b/>
+          <w:bCs/>
+          <w:sz w:val="28"/>
+          <w:szCs w:val="28"/>
+        </w:rPr>
+        <w:t>положение центра симметрии</w:t>
+      </w:r>
+      <w:r>
+        <w:rPr>
+          <w:sz w:val="28"/>
+          <w:szCs w:val="28"/>
+        </w:rPr>
+        <w:t xml:space="preserve"> на числовой оси.</w:t>
+      </w:r>
+    </w:p>
+    <w:p>
+      <w:pPr>
+        <w:numPr>
+          <w:ilvl w:val="0"/>
+          <w:numId w:val="10"/>
+        </w:numPr>
+        <w:spacing w:line="360" w:lineRule="auto"/>
+        <w:jc w:val="both"/>
+        <w:rPr>
+          <w:sz w:val="28"/>
+          <w:szCs w:val="28"/>
+        </w:rPr>
+      </w:pPr>
+      <w:r>
+        <w:rPr>
+          <w:sz w:val="28"/>
+          <w:szCs w:val="28"/>
+        </w:rPr>
+        <w:lastRenderedPageBreak/>
+        <w:t>При μ=0 — стандартное двойное гамма, симметрично относительно нуля</w:t>
+      </w:r>
+    </w:p>
+    <w:p>
+      <w:pPr>
+        <w:numPr>
+          <w:ilvl w:val="0"/>
+          <w:numId w:val="10"/>
+        </w:numPr>
+        <w:spacing w:line="360" w:lineRule="auto"/>
+        <w:jc w:val="both"/>
+        <w:rPr>
+          <w:sz w:val="28"/>
+          <w:szCs w:val="28"/>
+        </w:rPr>
+      </w:pPr>
+      <w:r>
+        <w:rPr>
+          <w:sz w:val="28"/>
+          <w:szCs w:val="28"/>
+        </w:rPr>
+        <w:t xml:space="preserve">При μ≠0 — вся кривая </w:t>
+      </w:r>
+      <w:r>
+        <w:rPr>
+          <w:b/>
+          <w:bCs/>
+          <w:sz w:val="28"/>
+          <w:szCs w:val="28"/>
+        </w:rPr>
+        <w:t>сдвигается целиком</w:t>
+      </w:r>
+      <w:r>
+        <w:rPr>
+          <w:sz w:val="28"/>
+          <w:szCs w:val="28"/>
+        </w:rPr>
+        <w:t xml:space="preserve"> вправо или влево</w:t>
+      </w:r>
+    </w:p>
+    <w:p>
+      <w:pPr>
+        <w:numPr>
+          <w:ilvl w:val="0"/>
+          <w:numId w:val="10"/>
+        </w:numPr>
+        <w:spacing w:line="360" w:lineRule="auto"/>
+        <w:jc w:val="both"/>
+        <w:rPr>
+          <w:sz w:val="28"/>
+          <w:szCs w:val="28"/>
+        </w:rPr>
+      </w:pPr>
+      <w:r>
+        <w:rPr>
+          <w:sz w:val="28"/>
+          <w:szCs w:val="28"/>
+        </w:rPr>
+        <w:t>Не влияет на форму и разброс — только на положение</w:t>
+      </w:r>
+      <w:r>
+        <w:rPr>
+          <w:sz w:val="28"/>
+          <w:szCs w:val="28"/>
+        </w:rPr>
+        <w:br/>
+        <w:t>Это означает, что среднее значения распределения равно ровно μ\mu μ.</w:t>
+      </w:r>
+    </w:p>
+    <w:p>
+      <w:pPr>
+        <w:spacing w:line="360" w:lineRule="auto"/>
+        <w:ind w:firstLine="360"/>
+        <w:jc w:val="both"/>
+        <w:rPr>
+          <w:b/>
+          <w:bCs/>
+          <w:sz w:val="28"/>
+          <w:szCs w:val="28"/>
+        </w:rPr>
+      </w:pPr>
+      <w:r>
+        <w:rPr>
+          <w:b/>
+          <w:bCs/>
+          <w:sz w:val="28"/>
+          <w:szCs w:val="28"/>
+        </w:rPr>
+        <w:t>β — параметр масштаба</w:t>
+      </w:r>
+    </w:p>
+    <w:p>
+      <w:pPr>
+        <w:spacing w:line="360" w:lineRule="auto"/>
+        <w:ind w:firstLine="360"/>
+        <w:jc w:val="both"/>
+        <w:rPr>
+          <w:sz w:val="28"/>
+          <w:szCs w:val="28"/>
+        </w:rPr>
+      </w:pPr>
+      <w:r>
+        <w:rPr>
+          <w:sz w:val="28"/>
+          <w:szCs w:val="28"/>
+        </w:rPr>
+        <w:t xml:space="preserve">Отвечает за растяжение или сжатие распределения вдоль оси </w:t>
+      </w:r>
+      <m:oMath>
+        <m:r>
+          <w:rPr>
+            <w:rFonts w:ascii="Cambria Math" w:hAnsi="Cambria Math"/>
+            <w:sz w:val="28"/>
+            <w:szCs w:val="28"/>
+          </w:rPr>
+          <m:t>x</m:t>
+        </m:r>
+      </m:oMath>
+      <w:r>
+        <w:rPr>
+          <w:sz w:val="28"/>
+          <w:szCs w:val="28"/>
+        </w:rPr>
+        <w:t>.</w:t>
+      </w:r>
+    </w:p>
+    <w:p>
+      <w:pPr>
+        <w:numPr>
+          <w:ilvl w:val="0"/>
+          <w:numId w:val="11"/>
+        </w:numPr>
+        <w:spacing w:line="360" w:lineRule="auto"/>
+        <w:jc w:val="both"/>
+        <w:rPr>
+          <w:sz w:val="28"/>
+          <w:szCs w:val="28"/>
+        </w:rPr>
+      </w:pPr>
+      <w:r>
+        <w:rPr>
+          <w:sz w:val="28"/>
+          <w:szCs w:val="28"/>
+        </w:rPr>
+        <w:t xml:space="preserve">Чем больше </w:t>
+      </w:r>
+      <m:oMath>
+        <m:r>
+          <w:rPr>
+            <w:rFonts w:ascii="Cambria Math" w:hAnsi="Cambria Math"/>
+            <w:sz w:val="28"/>
+            <w:szCs w:val="28"/>
+          </w:rPr>
+          <m:t>β</m:t>
+        </m:r>
+      </m:oMath>
+      <w:r>
+        <w:rPr>
+          <w:sz w:val="28"/>
+          <w:szCs w:val="28"/>
+        </w:rPr>
+        <w:t>— тем шире и ниже кривая, пики дальше друг от друга;</w:t>
+      </w:r>
+    </w:p>
+    <w:p>
+      <w:pPr>
+        <w:numPr>
+          <w:ilvl w:val="0"/>
+          <w:numId w:val="11"/>
+        </w:numPr>
+        <w:spacing w:line="360" w:lineRule="auto"/>
+        <w:jc w:val="both"/>
+        <w:rPr>
+          <w:sz w:val="28"/>
+          <w:szCs w:val="28"/>
+        </w:rPr>
+      </w:pPr>
+      <w:r>
+        <w:rPr>
+          <w:sz w:val="28"/>
+          <w:szCs w:val="28"/>
+        </w:rPr>
+        <w:t xml:space="preserve">Чем меньше </w:t>
+      </w:r>
+      <m:oMath>
+        <m:r>
+          <w:rPr>
+            <w:rFonts w:ascii="Cambria Math" w:hAnsi="Cambria Math"/>
+            <w:sz w:val="28"/>
+            <w:szCs w:val="28"/>
+          </w:rPr>
+          <m:t>β</m:t>
+        </m:r>
+      </m:oMath>
+      <w:r>
+        <w:rPr>
+          <w:sz w:val="28"/>
+          <w:szCs w:val="28"/>
+        </w:rPr>
+        <w:t>— тем уже и выше кривая, пики ближе друг к другу;</w:t>
+      </w:r>
+    </w:p>
+    <w:p>
+      <w:pPr>
+        <w:numPr>
+          <w:ilvl w:val="0"/>
+          <w:numId w:val="11"/>
+        </w:numPr>
+        <w:spacing w:line="360" w:lineRule="auto"/>
+        <w:jc w:val="both"/>
+        <w:rPr>
+          <w:sz w:val="28"/>
+          <w:szCs w:val="28"/>
+        </w:rPr>
+      </w:pPr>
+      <w:r>
+        <w:rPr>
+          <w:sz w:val="28"/>
+          <w:szCs w:val="28"/>
+        </w:rPr>
+        <w:t>Не меняет положение центра симметрии — только масштаб.</w:t>
+      </w:r>
+    </w:p>
+    <w:p>
+      <w:pPr>
+        <w:spacing w:line="360" w:lineRule="auto"/>
+        <w:ind w:firstLine="360"/>
+        <w:jc w:val="both"/>
+        <w:rPr>
+          <w:sz w:val="28"/>
+          <w:szCs w:val="28"/>
+        </w:rPr>
+      </w:pPr>
+    </w:p>
+    <w:p>
+      <w:pPr>
+        <w:pStyle w:val="a7"/>
+        <w:numPr>
+          <w:ilvl w:val="1"/>
+          <w:numId w:val="3"/>
+        </w:numPr>
+        <w:rPr>
+          <w:b/>
+          <w:bCs/>
+          <w:sz w:val="28"/>
+          <w:szCs w:val="28"/>
+        </w:rPr>
+      </w:pPr>
+      <w:r>
+        <w:rPr>
+          <w:b/>
+          <w:bCs/>
+          <w:sz w:val="28"/>
+          <w:szCs w:val="28"/>
+        </w:rPr>
+        <w:t>Функция построения теоретической функции распределения.</w:t>
+      </w:r>
+    </w:p>
+    <w:p>
+      <w:pPr>
+        <w:spacing w:line="360" w:lineRule="auto"/>
+        <w:jc w:val="both"/>
+        <w:rPr>
+          <w:sz w:val="28"/>
+          <w:szCs w:val="28"/>
+        </w:rPr>
+      </w:pPr>
+      <w:r>
+        <w:rPr>
+          <w:noProof/>
+          <w:sz w:val="28"/>
+          <w:szCs w:val="28"/>
+        </w:rPr>
+        <w:drawing>
+          <wp:inline distT="0" distB="0" distL="0" distR="0" wp14:anchorId="3D52F5E0" wp14:editId="3814D755">
+            <wp:extent cx="5433085" cy="4930140"/>
+            <wp:effectExtent l="0" t="0" r="0" b="3810"/>
+            <wp:docPr id="1062371791" name="Рисунок 1"/>
+            <wp:cNvGraphicFramePr>
+              <a:graphicFrameLocks xmlns:a="http://schemas.openxmlformats.org/drawingml/2006/main" noChangeAspect="1"/>
+            </wp:cNvGraphicFramePr>
+            <a:graphic xmlns:a="http://schemas.openxmlformats.org/drawingml/2006/main">
+              <a:graphicData uri="http://schemas.openxmlformats.org/drawingml/2006/picture">
+                <pic:pic xmlns:pic="http://schemas.openxmlformats.org/drawingml/2006/picture">
+                  <pic:nvPicPr>
+                    <pic:cNvPr id="1062371791" name=""/>
+                    <pic:cNvPicPr/>
+                  </pic:nvPicPr>
+                  <pic:blipFill>
+                    <a:blip r:embed="rId27"/>
+                    <a:stretch>
+                      <a:fillRect/>
+                    </a:stretch>
+                  </pic:blipFill>
+                  <pic:spPr>
+                    <a:xfrm>
+                      <a:off x="0" y="0"/>
+                      <a:ext cx="5433085" cy="4930140"/>
+                    </a:xfrm>
+                    <a:prstGeom prst="rect">
+                      <a:avLst/>
+                    </a:prstGeom>
+                  </pic:spPr>
+                </pic:pic>
+              </a:graphicData>
+            </a:graphic>
+          </wp:inline>
+        </w:drawing>
+      </w:r>
+    </w:p>
+    <w:p>
+      <w:pPr>
+        <w:ind w:firstLine="360"/>
+        <w:jc w:val="center"/>
+        <w:rPr>
+          <w:sz w:val="28"/>
+          <w:szCs w:val="28"/>
+        </w:rPr>
+      </w:pPr>
+      <w:r>
+        <w:rPr>
+          <w:sz w:val="28"/>
+          <w:szCs w:val="28"/>
+        </w:rPr>
+        <w:t>Листинг 11. Функция построения теоретической функции распределения</w:t>
+      </w:r>
+    </w:p>
+    <w:p>
+      <w:pPr>
+        <w:ind w:firstLine="360"/>
+        <w:jc w:val="center"/>
+        <w:rPr>
+          <w:sz w:val="28"/>
+          <w:szCs w:val="28"/>
+        </w:rPr>
+      </w:pPr>
+    </w:p>
+    <w:p>
+      <w:pPr>
+        <w:spacing w:line="360" w:lineRule="auto"/>
+        <w:jc w:val="both"/>
+        <w:rPr>
+          <w:sz w:val="28"/>
+          <w:szCs w:val="28"/>
+        </w:rPr>
+      </w:pPr>
+      <w:r>
+        <w:rPr>
+          <w:noProof/>
+          <w:sz w:val="28"/>
+          <w:szCs w:val="28"/>
+        </w:rPr>
+        <w:lastRenderedPageBreak/>
+        <w:drawing>
+          <wp:inline distT="0" distB="0" distL="0" distR="0" wp14:anchorId="4EBCD29B" wp14:editId="390471AA">
+            <wp:extent cx="5935980" cy="3352800"/>
+            <wp:effectExtent l="0" t="0" r="7620" b="0"/>
+            <wp:docPr id="1881831513" name="Рисунок 1"/>
+            <wp:cNvGraphicFramePr>
+              <a:graphicFrameLocks xmlns:a="http://schemas.openxmlformats.org/drawingml/2006/main" noChangeAspect="1"/>
+            </wp:cNvGraphicFramePr>
+            <a:graphic xmlns:a="http://schemas.openxmlformats.org/drawingml/2006/main">
+              <a:graphicData uri="http://schemas.openxmlformats.org/drawingml/2006/picture">
+                <pic:pic xmlns:pic="http://schemas.openxmlformats.org/drawingml/2006/picture">
+                  <pic:nvPicPr>
+                    <pic:cNvPr id="0" name="Picture 1"/>
+                    <pic:cNvPicPr>
+                      <a:picLocks noChangeAspect="1" noChangeArrowheads="1"/>
+                    </pic:cNvPicPr>
+                  </pic:nvPicPr>
+                  <pic:blipFill>
+                    <a:blip r:embed="rId28">
+                      <a:extLst>
+                        <a:ext uri="{28A0092B-C50C-407E-A947-70E740481C1C}">
+                          <a14:useLocalDpi xmlns:a14="http://schemas.microsoft.com/office/drawing/2010/main" val="0"/>
+                        </a:ext>
+                      </a:extLst>
+                    </a:blip>
+                    <a:srcRect/>
+                    <a:stretch>
+                      <a:fillRect/>
+                    </a:stretch>
+                  </pic:blipFill>
+                  <pic:spPr bwMode="auto">
+                    <a:xfrm>
+                      <a:off x="0" y="0"/>
+                      <a:ext cx="5935980" cy="3352800"/>
+                    </a:xfrm>
+                    <a:prstGeom prst="rect">
+                      <a:avLst/>
+                    </a:prstGeom>
+                    <a:noFill/>
+                    <a:ln>
+                      <a:noFill/>
+                    </a:ln>
+                  </pic:spPr>
+                </pic:pic>
+              </a:graphicData>
+            </a:graphic>
+          </wp:inline>
+        </w:drawing>
+      </w:r>
+    </w:p>
+    <w:p>
+      <w:pPr>
+        <w:spacing w:line="360" w:lineRule="auto"/>
+        <w:jc w:val="center"/>
+        <w:rPr>
+          <w:b/>
+          <w:bCs/>
+          <w:sz w:val="28"/>
+          <w:szCs w:val="28"/>
+        </w:rPr>
+      </w:pPr>
+      <w:r>
+        <w:rPr>
+          <w:sz w:val="28"/>
+          <w:szCs w:val="28"/>
+        </w:rPr>
+        <w:t>Рисунок 10. График теоретической функции распределения</w:t>
+      </w:r>
+    </w:p>
+    <w:p>
+      <w:pPr>
+        <w:rPr>
+          <w:b/>
+          <w:bCs/>
+          <w:sz w:val="28"/>
+          <w:szCs w:val="28"/>
+        </w:rPr>
+      </w:pPr>
+      <w:r>
+        <w:rPr>
+          <w:b/>
+          <w:bCs/>
+          <w:noProof/>
+          <w:sz w:val="28"/>
+          <w:szCs w:val="28"/>
+        </w:rPr>
+        <w:drawing>
+          <wp:inline distT="0" distB="0" distL="0" distR="0" wp14:anchorId="6851B8D4" wp14:editId="40FDED88">
+            <wp:extent cx="5935980" cy="3192780"/>
+            <wp:effectExtent l="0" t="0" r="7620" b="7620"/>
+            <wp:docPr id="1395738731" name="Рисунок 2"/>
+            <wp:cNvGraphicFramePr>
+              <a:graphicFrameLocks xmlns:a="http://schemas.openxmlformats.org/drawingml/2006/main" noChangeAspect="1"/>
+            </wp:cNvGraphicFramePr>
+            <a:graphic xmlns:a="http://schemas.openxmlformats.org/drawingml/2006/main">
+              <a:graphicData uri="http://schemas.openxmlformats.org/drawingml/2006/picture">
+                <pic:pic xmlns:pic="http://schemas.openxmlformats.org/drawingml/2006/picture">
+                  <pic:nvPicPr>
+                    <pic:cNvPr id="0" name="Picture 2"/>
+                    <pic:cNvPicPr>
+                      <a:picLocks noChangeAspect="1" noChangeArrowheads="1"/>
+                    </pic:cNvPicPr>
+                  </pic:nvPicPr>
+                  <pic:blipFill>
+                    <a:blip r:embed="rId29">
+                      <a:extLst>
+                        <a:ext uri="{28A0092B-C50C-407E-A947-70E740481C1C}">
+                          <a14:useLocalDpi xmlns:a14="http://schemas.microsoft.com/office/drawing/2010/main" val="0"/>
+                        </a:ext>
+                      </a:extLst>
+                    </a:blip>
+                    <a:srcRect/>
+                    <a:stretch>
+                      <a:fillRect/>
+                    </a:stretch>
+                  </pic:blipFill>
+                  <pic:spPr bwMode="auto">
+                    <a:xfrm>
+                      <a:off x="0" y="0"/>
+                      <a:ext cx="5935980" cy="3192780"/>
+                    </a:xfrm>
+                    <a:prstGeom prst="rect">
+                      <a:avLst/>
+                    </a:prstGeom>
+                    <a:noFill/>
+                    <a:ln>
+                      <a:noFill/>
+                    </a:ln>
+                  </pic:spPr>
+                </pic:pic>
+              </a:graphicData>
+            </a:graphic>
+          </wp:inline>
+        </w:drawing>
+      </w:r>
+    </w:p>
+    <w:p>
+      <w:pPr>
+        <w:spacing w:line="360" w:lineRule="auto"/>
+        <w:jc w:val="center"/>
+        <w:rPr>
+          <w:sz w:val="28"/>
+          <w:szCs w:val="28"/>
+        </w:rPr>
+      </w:pPr>
+      <w:r>
+        <w:rPr>
+          <w:sz w:val="28"/>
+          <w:szCs w:val="28"/>
+        </w:rPr>
+        <w:t>Рисунок 11. График теоретических функций распределения со случайно заданными параметрами распределения.</w:t>
+      </w:r>
+    </w:p>
+    <w:p>
+      <w:pPr>
+        <w:pStyle w:val="a7"/>
+        <w:numPr>
+          <w:ilvl w:val="1"/>
+          <w:numId w:val="3"/>
+        </w:numPr>
+        <w:rPr>
+          <w:b/>
+          <w:bCs/>
+          <w:sz w:val="28"/>
+          <w:szCs w:val="28"/>
+        </w:rPr>
+      </w:pPr>
+      <w:r>
+        <w:rPr>
+          <w:b/>
+          <w:bCs/>
+          <w:sz w:val="28"/>
+          <w:szCs w:val="28"/>
+        </w:rPr>
+        <w:t>Оценка влияния параметров распределения на вид графика распределения</w:t>
+      </w:r>
+    </w:p>
+    <w:p>
+      <w:pPr>
+        <w:spacing w:before="100" w:beforeAutospacing="1" w:after="100" w:afterAutospacing="1" w:line="360" w:lineRule="auto"/>
+        <w:jc w:val="center"/>
+        <w:rPr>
+          <w:sz w:val="28"/>
+          <w:szCs w:val="28"/>
+        </w:rPr>
+      </w:pPr>
+      <w:r>
+        <w:rPr>
+          <w:noProof/>
+          <w:sz w:val="24"/>
+          <w:szCs w:val="24"/>
+        </w:rPr>
+        <w:lastRenderedPageBreak/>
+        <w:drawing>
+          <wp:inline distT="0" distB="0" distL="0" distR="0" wp14:anchorId="6A42B13A" wp14:editId="2572DF9B">
+            <wp:extent cx="5935980" cy="3177540"/>
+            <wp:effectExtent l="0" t="0" r="7620" b="3810"/>
+            <wp:docPr id="641265952" name="Рисунок 3"/>
+            <wp:cNvGraphicFramePr>
+              <a:graphicFrameLocks xmlns:a="http://schemas.openxmlformats.org/drawingml/2006/main" noChangeAspect="1"/>
+            </wp:cNvGraphicFramePr>
+            <a:graphic xmlns:a="http://schemas.openxmlformats.org/drawingml/2006/main">
+              <a:graphicData uri="http://schemas.openxmlformats.org/drawingml/2006/picture">
+                <pic:pic xmlns:pic="http://schemas.openxmlformats.org/drawingml/2006/picture">
+                  <pic:nvPicPr>
+                    <pic:cNvPr id="0" name="Picture 3"/>
+                    <pic:cNvPicPr>
+                      <a:picLocks noChangeAspect="1" noChangeArrowheads="1"/>
+                    </pic:cNvPicPr>
+                  </pic:nvPicPr>
+                  <pic:blipFill>
+                    <a:blip r:embed="rId30">
+                      <a:extLst>
+                        <a:ext uri="{28A0092B-C50C-407E-A947-70E740481C1C}">
+                          <a14:useLocalDpi xmlns:a14="http://schemas.microsoft.com/office/drawing/2010/main" val="0"/>
+                        </a:ext>
+                      </a:extLst>
+                    </a:blip>
+                    <a:srcRect/>
+                    <a:stretch>
+                      <a:fillRect/>
+                    </a:stretch>
+                  </pic:blipFill>
+                  <pic:spPr bwMode="auto">
+                    <a:xfrm>
+                      <a:off x="0" y="0"/>
+                      <a:ext cx="5935980" cy="3177540"/>
+                    </a:xfrm>
+                    <a:prstGeom prst="rect">
+                      <a:avLst/>
+                    </a:prstGeom>
+                    <a:noFill/>
+                    <a:ln>
+                      <a:noFill/>
+                    </a:ln>
+                  </pic:spPr>
+                </pic:pic>
+              </a:graphicData>
+            </a:graphic>
+          </wp:inline>
+        </w:drawing>
+      </w:r>
+      <w:r>
+        <w:rPr>
+          <w:sz w:val="24"/>
+          <w:szCs w:val="24"/>
+        </w:rPr>
+        <w:br/>
+      </w:r>
+      <w:r>
+        <w:rPr>
+          <w:sz w:val="28"/>
+          <w:szCs w:val="28"/>
+        </w:rPr>
+        <w:t>Рисунок 12. График теоретических функций распределения с различными параметрами формы.</w:t>
+      </w:r>
+    </w:p>
+    <w:p>
+      <w:pPr>
+        <w:spacing w:before="100" w:beforeAutospacing="1" w:after="100" w:afterAutospacing="1" w:line="360" w:lineRule="auto"/>
+        <w:rPr>
+          <w:sz w:val="28"/>
+          <w:szCs w:val="28"/>
+        </w:rPr>
+      </w:pPr>
+      <w:r>
+        <w:rPr>
+          <w:sz w:val="28"/>
+          <w:szCs w:val="28"/>
+        </w:rPr>
+        <w:t>Оценка</w:t>
+      </w:r>
+      <w:r>
+        <w:rPr>
+          <w:sz w:val="28"/>
+          <w:szCs w:val="28"/>
+        </w:rPr>
+        <w:t xml:space="preserve">: </w:t>
+      </w:r>
+      <w:r>
+        <w:rPr>
+          <w:sz w:val="28"/>
+          <w:szCs w:val="28"/>
+        </w:rPr>
+        <w:t>при увеличении параметра формы пики расходятся сильнее. высота пиков падает, а также растет разброс</w:t>
+      </w:r>
+      <w:r>
+        <w:rPr>
+          <w:sz w:val="28"/>
+          <w:szCs w:val="28"/>
+        </w:rPr>
+        <w:t>.</w:t>
+      </w:r>
+    </w:p>
+    <w:p>
+      <w:pPr>
+        <w:spacing w:before="100" w:beforeAutospacing="1" w:after="100" w:afterAutospacing="1"/>
+        <w:rPr>
+          <w:sz w:val="28"/>
+          <w:szCs w:val="28"/>
+        </w:rPr>
+      </w:pPr>
+    </w:p>
+    <w:p>
+      <w:pPr>
+        <w:spacing w:before="100" w:beforeAutospacing="1" w:after="100" w:afterAutospacing="1"/>
+        <w:rPr>
+          <w:sz w:val="28"/>
+          <w:szCs w:val="28"/>
+        </w:rPr>
+      </w:pPr>
+      <w:r>
+        <w:rPr>
+          <w:noProof/>
+          <w:sz w:val="28"/>
+          <w:szCs w:val="28"/>
+        </w:rPr>
+        <w:drawing>
+          <wp:inline distT="0" distB="0" distL="0" distR="0" wp14:anchorId="7A41816E" wp14:editId="5CBD4247">
+            <wp:extent cx="5935980" cy="3131820"/>
+            <wp:effectExtent l="0" t="0" r="7620" b="0"/>
+            <wp:docPr id="359336630" name="Рисунок 4"/>
+            <wp:cNvGraphicFramePr>
+              <a:graphicFrameLocks xmlns:a="http://schemas.openxmlformats.org/drawingml/2006/main" noChangeAspect="1"/>
+            </wp:cNvGraphicFramePr>
+            <a:graphic xmlns:a="http://schemas.openxmlformats.org/drawingml/2006/main">
+              <a:graphicData uri="http://schemas.openxmlformats.org/drawingml/2006/picture">
+                <pic:pic xmlns:pic="http://schemas.openxmlformats.org/drawingml/2006/picture">
+                  <pic:nvPicPr>
+                    <pic:cNvPr id="0" name="Picture 4"/>
+                    <pic:cNvPicPr>
+                      <a:picLocks noChangeAspect="1" noChangeArrowheads="1"/>
+                    </pic:cNvPicPr>
+                  </pic:nvPicPr>
+                  <pic:blipFill>
+                    <a:blip r:embed="rId31">
+                      <a:extLst>
+                        <a:ext uri="{28A0092B-C50C-407E-A947-70E740481C1C}">
+                          <a14:useLocalDpi xmlns:a14="http://schemas.microsoft.com/office/drawing/2010/main" val="0"/>
+                        </a:ext>
+                      </a:extLst>
+                    </a:blip>
+                    <a:srcRect/>
+                    <a:stretch>
+                      <a:fillRect/>
+                    </a:stretch>
+                  </pic:blipFill>
+                  <pic:spPr bwMode="auto">
+                    <a:xfrm>
+                      <a:off x="0" y="0"/>
+                      <a:ext cx="5935980" cy="3131820"/>
+                    </a:xfrm>
+                    <a:prstGeom prst="rect">
+                      <a:avLst/>
+                    </a:prstGeom>
+                    <a:noFill/>
+                    <a:ln>
+                      <a:noFill/>
+                    </a:ln>
+                  </pic:spPr>
+                </pic:pic>
+              </a:graphicData>
+            </a:graphic>
+          </wp:inline>
+        </w:drawing>
+      </w:r>
+    </w:p>
+    <w:p>
+      <w:pPr>
+        <w:spacing w:before="100" w:beforeAutospacing="1" w:after="100" w:afterAutospacing="1" w:line="360" w:lineRule="auto"/>
+        <w:jc w:val="center"/>
+        <w:rPr>
+          <w:sz w:val="28"/>
+          <w:szCs w:val="28"/>
+        </w:rPr>
+      </w:pPr>
+      <w:r>
+        <w:rPr>
+          <w:sz w:val="28"/>
+          <w:szCs w:val="28"/>
+        </w:rPr>
+        <w:t>Рисунок 12. График теоретических функций распределения с различными параметрами смещения.</w:t>
+      </w:r>
+    </w:p>
+    <w:p>
+      <w:pPr>
+        <w:spacing w:before="100" w:beforeAutospacing="1" w:after="100" w:afterAutospacing="1" w:line="360" w:lineRule="auto"/>
+        <w:jc w:val="both"/>
+        <w:rPr>
+          <w:sz w:val="28"/>
+          <w:szCs w:val="28"/>
+        </w:rPr>
+      </w:pPr>
+      <w:r>
+        <w:rPr>
+          <w:sz w:val="28"/>
+          <w:szCs w:val="28"/>
+        </w:rPr>
+        <w:lastRenderedPageBreak/>
+        <w:t xml:space="preserve">Оценка: </w:t>
+      </w:r>
+      <w:r>
+        <w:rPr>
+          <w:sz w:val="28"/>
+          <w:szCs w:val="28"/>
+        </w:rPr>
+        <w:t>при увеличении параметра смещения не изменяется форма кривой, расстояние между пиками и высота пиков. Изменяется только центр симметрии у двойного гамма распределения</w:t>
+      </w:r>
+      <w:r>
+        <w:rPr>
+          <w:sz w:val="28"/>
+          <w:szCs w:val="28"/>
+        </w:rPr>
+        <w:t>.</w:t>
+      </w:r>
+    </w:p>
+    <w:p>
+      <w:pPr>
+        <w:spacing w:line="360" w:lineRule="auto"/>
+        <w:rPr>
+          <w:sz w:val="28"/>
+          <w:szCs w:val="28"/>
+        </w:rPr>
+      </w:pPr>
+    </w:p>
+    <w:p>
+      <w:pPr>
+        <w:spacing w:line="360" w:lineRule="auto"/>
+        <w:jc w:val="center"/>
+        <w:rPr>
+          <w:b/>
+          <w:bCs/>
+          <w:sz w:val="28"/>
+          <w:szCs w:val="28"/>
+        </w:rPr>
+      </w:pPr>
+      <w:r>
+        <w:rPr>
+          <w:b/>
+          <w:bCs/>
+          <w:sz w:val="28"/>
+          <w:szCs w:val="28"/>
+        </w:rPr>
+        <w:t>Список</w:t>
+      </w:r>
+      <w:r>
+        <w:rPr>
+          <w:b/>
+          <w:bCs/>
+          <w:sz w:val="28"/>
+          <w:szCs w:val="28"/>
+        </w:rPr>
+        <w:t xml:space="preserve"> </w:t>
+      </w:r>
+      <w:r>
+        <w:rPr>
+          <w:b/>
+          <w:bCs/>
+          <w:sz w:val="28"/>
+          <w:szCs w:val="28"/>
+        </w:rPr>
+        <w:t>использованной</w:t>
+      </w:r>
+      <w:r>
+        <w:rPr>
+          <w:b/>
+          <w:bCs/>
+          <w:sz w:val="28"/>
+          <w:szCs w:val="28"/>
+        </w:rPr>
+        <w:t xml:space="preserve"> </w:t>
+      </w:r>
+      <w:r>
+        <w:rPr>
+          <w:b/>
+          <w:bCs/>
+          <w:sz w:val="28"/>
+          <w:szCs w:val="28"/>
+        </w:rPr>
+        <w:t>литературы</w:t>
+      </w:r>
+    </w:p>
+    <w:p>
+      <w:pPr>
+        <w:spacing w:line="360" w:lineRule="auto"/>
+        <w:jc w:val="center"/>
+        <w:rPr>
+          <w:b/>
+          <w:bCs/>
+          <w:sz w:val="28"/>
+          <w:szCs w:val="28"/>
+        </w:rPr>
+      </w:pPr>
+    </w:p>
+    <w:p>
+      <w:pPr>
+        <w:spacing w:line="360" w:lineRule="auto"/>
+        <w:jc w:val="both"/>
+        <w:rPr>
+          <w:sz w:val="28"/>
+          <w:szCs w:val="28"/>
           <w:lang w:val="en-US"/>
         </w:rPr>
-        <w:t>[1] Pearson K. Tables of the Incomplete Gamma-Function / computed by the staff of the Department of Applied Statistics, University of London. — London : University of London, 1922. — URL</w:t>
-      </w:r>
-      <w:r>
-        <w:rPr>
+      </w:pPr>
+      <w:r>
+        <w:rPr>
+          <w:b/>
+          <w:bCs/>
           <w:sz w:val="28"/>
           <w:szCs w:val="28"/>
           <w:lang w:val="en-US"/>
         </w:rPr>
+        <w:t>[1] Pearson K. Tables of the Incomplete Gamma-Function / computed by the staff of the Department of Applied Statistics, University of London. — London: University of London, 1922. — URL</w:t>
+      </w:r>
+      <w:r>
+        <w:rPr>
+          <w:sz w:val="28"/>
+          <w:szCs w:val="28"/>
+          <w:lang w:val="en-US"/>
+        </w:rPr>
         <w:t xml:space="preserve">: </w:t>
       </w:r>
-      <w:hyperlink r:id="rId26" w:history="1">
+      <w:hyperlink r:id="rId32" w:history="1">
         <w:r>
           <w:rPr>
             <w:rStyle w:val="ac"/>
@@ -7640,24 +9443,10 @@
           <w:szCs w:val="28"/>
           <w:lang w:val="en-US"/>
         </w:rPr>
-        <w:t>[2] Bain L. J., Engelhardt M. Introduction to Probability and Mathematical Statistics. — 2nd ed. — Belmont : Brooks/Cole, 1992. — 644 p.</w:t>
-      </w:r>
-    </w:p>
-    <w:p>
-      <w:pPr>
-        <w:spacing w:line="360" w:lineRule="auto"/>
-        <w:jc w:val="both"/>
-        <w:rPr>
-          <w:sz w:val="28"/>
-          <w:szCs w:val="28"/>
-          <w:lang w:val="en-US"/>
-        </w:rPr>
-      </w:pPr>
-    </w:p>
-    <w:p>
-      <w:pPr>
-        <w:spacing w:line="360" w:lineRule="auto"/>
-        <w:jc w:val="both"/>
+        <w:t xml:space="preserve">[2] Bain L. J., Engelhardt M. Introduction to Probability and Mathematical Statistics. — 2nd ed. — </w:t>
+      </w:r>
+      <w:proofErr w:type="gramStart"/>
+      <w:r>
         <w:rPr>
           <w:b/>
           <w:bCs/>
@@ -7665,7 +9454,9 @@
           <w:szCs w:val="28"/>
           <w:lang w:val="en-US"/>
         </w:rPr>
-      </w:pPr>
+        <w:t>Belmont :</w:t>
+      </w:r>
+      <w:proofErr w:type="gramEnd"/>
       <w:r>
         <w:rPr>
           <w:b/>
@@ -7674,7 +9465,7 @@
           <w:szCs w:val="28"/>
           <w:lang w:val="en-US"/>
         </w:rPr>
-        <w:t xml:space="preserve">[3] Bahashwan A. O., Kalantan Z. I., Adham S. A. Double Gamma Principal Components Analysis // Applied Mathematical Sciences. — 2018. — Vol. 12, № 11. — P. 523–533. </w:t>
+        <w:t xml:space="preserve"> Brooks/Cole, 1992. — 644 p.</w:t>
       </w:r>
     </w:p>
     <w:p>
@@ -7692,31 +9483,41 @@
       <w:pPr>
         <w:spacing w:line="360" w:lineRule="auto"/>
         <w:jc w:val="both"/>
-        <w:rPr>
-          <w:sz w:val="28"/>
-          <w:szCs w:val="28"/>
-        </w:rPr>
-      </w:pPr>
-      <w:r>
         <w:rPr>
           <w:b/>
           <w:bCs/>
           <w:sz w:val="28"/>
           <w:szCs w:val="28"/>
-        </w:rPr>
-        <w:t xml:space="preserve">[4] Положинцев Б. И. Теория вероятностей и математическая статистика. Введение в математическую статистику: учебное пособие /  Б. И. Положинцев. – Санкт-Петербург: </w:t>
-      </w:r>
-      <w:proofErr w:type="spellStart"/>
+          <w:lang w:val="en-US"/>
+        </w:rPr>
+      </w:pPr>
       <w:r>
         <w:rPr>
           <w:b/>
           <w:bCs/>
           <w:sz w:val="28"/>
           <w:szCs w:val="28"/>
-        </w:rPr>
-        <w:t>СПбПУ</w:t>
-      </w:r>
-      <w:proofErr w:type="spellEnd"/>
+          <w:lang w:val="en-US"/>
+        </w:rPr>
+        <w:t xml:space="preserve">[3] Bahashwan A. O., Kalantan Z. I., Adham S. A. Double Gamma Principal Components Analysis // Applied Mathematical Sciences. — 2018. — Vol. 12, № 11. — P. 523–533. </w:t>
+      </w:r>
+    </w:p>
+    <w:p>
+      <w:pPr>
+        <w:spacing w:line="360" w:lineRule="auto"/>
+        <w:jc w:val="both"/>
+        <w:rPr>
+          <w:sz w:val="28"/>
+          <w:szCs w:val="28"/>
+          <w:lang w:val="en-US"/>
+        </w:rPr>
+      </w:pPr>
+    </w:p>
+    <w:p>
+      <w:pPr>
+        <w:spacing w:line="360" w:lineRule="auto"/>
+        <w:jc w:val="both"/>
+      </w:pPr>
       <w:r>
         <w:rPr>
           <w:b/>
@@ -7724,8 +9525,9 @@
           <w:sz w:val="28"/>
           <w:szCs w:val="28"/>
         </w:rPr>
-        <w:t>, 2016.</w:t>
-      </w:r>
+        <w:t xml:space="preserve">[4] Положинцев Б. И. Теория вероятностей и математическая статистика. Введение в математическую статистику: учебное пособие </w:t>
+      </w:r>
+      <w:proofErr w:type="gramStart"/>
       <w:r>
         <w:rPr>
           <w:b/>
@@ -7733,8 +9535,9 @@
           <w:sz w:val="28"/>
           <w:szCs w:val="28"/>
         </w:rPr>
-        <w:t xml:space="preserve"> </w:t>
-      </w:r>
+        <w:t>/  Б.</w:t>
+      </w:r>
+      <w:proofErr w:type="gramEnd"/>
       <w:r>
         <w:rPr>
           <w:b/>
@@ -7742,6 +9545,24 @@
           <w:sz w:val="28"/>
           <w:szCs w:val="28"/>
         </w:rPr>
+        <w:t xml:space="preserve"> И. Положинцев. – Санкт-Петербург: СПбПУ, 2016.</w:t>
+      </w:r>
+      <w:r>
+        <w:rPr>
+          <w:b/>
+          <w:bCs/>
+          <w:sz w:val="28"/>
+          <w:szCs w:val="28"/>
+        </w:rPr>
+        <w:t xml:space="preserve"> </w:t>
+      </w:r>
+      <w:r>
+        <w:rPr>
+          <w:b/>
+          <w:bCs/>
+          <w:sz w:val="28"/>
+          <w:szCs w:val="28"/>
+        </w:rPr>
         <w:t>– URL:</w:t>
       </w:r>
       <w:r>
@@ -7751,7 +9572,7 @@
         </w:rPr>
         <w:t xml:space="preserve"> </w:t>
       </w:r>
-      <w:hyperlink r:id="rId27" w:history="1">
+      <w:hyperlink r:id="rId33" w:history="1">
         <w:r>
           <w:rPr>
             <w:rStyle w:val="ac"/>
@@ -7761,6 +9582,55 @@
           <w:t>https://elib.spbstu.ru/dl/2/s16-286.pdf/download/s16-286.pdf</w:t>
         </w:r>
       </w:hyperlink>
+    </w:p>
+    <w:p>
+      <w:pPr>
+        <w:spacing w:line="360" w:lineRule="auto"/>
+        <w:jc w:val="both"/>
+      </w:pPr>
+    </w:p>
+    <w:p>
+      <w:pPr>
+        <w:spacing w:line="360" w:lineRule="auto"/>
+        <w:jc w:val="both"/>
+        <w:rPr>
+          <w:b/>
+          <w:bCs/>
+          <w:sz w:val="28"/>
+          <w:szCs w:val="28"/>
+          <w:lang w:val="en-US"/>
+        </w:rPr>
+      </w:pPr>
+      <w:r>
+        <w:rPr>
+          <w:b/>
+          <w:bCs/>
+          <w:sz w:val="28"/>
+          <w:szCs w:val="28"/>
+          <w:lang w:val="en-US"/>
+        </w:rPr>
+        <w:t>[</w:t>
+      </w:r>
+      <w:r>
+        <w:rPr>
+          <w:b/>
+          <w:bCs/>
+          <w:sz w:val="28"/>
+          <w:szCs w:val="28"/>
+          <w:lang w:val="en-US"/>
+        </w:rPr>
+        <w:t>5</w:t>
+      </w:r>
+      <w:r>
+        <w:rPr>
+          <w:b/>
+          <w:bCs/>
+          <w:sz w:val="28"/>
+          <w:szCs w:val="28"/>
+          <w:lang w:val="en-US"/>
+        </w:rPr>
+        <w:t>] The Double Gamma Distribution // Appendix A. - Florida International University, 2022. - P. 63–64.</w:t>
+      </w:r>
     </w:p>
     <w:sectPr>
       <w:pgSz w:w="11906" w:h="16838"/>
@@ -7775,6 +9645,155 @@
 <file path=word/numbering.xml><?xml version="1.0" encoding="utf-8"?>
 <w:numbering xmlns:wpc="http://schemas.microsoft.com/office/word/2010/wordprocessingCanvas" xmlns:cx="http://schemas.microsoft.com/office/drawing/2014/chartex" xmlns:cx1="http://schemas.microsoft.com/office/drawing/2015/9/8/chartex" xmlns:cx2="http://schemas.microsoft.com/office/drawing/2015/10/21/chartex" xmlns:cx3="http://schemas.microsoft.com/office/drawing/2016/5/9/chartex" xmlns:cx4="http://schemas.microsoft.com/office/drawing/2016/5/10/chartex" xmlns:cx5="http://schemas.microsoft.com/office/drawing/2016/5/11/chartex" xmlns:cx6="http://schemas.microsoft.com/office/drawing/2016/5/12/chartex" xmlns:cx7="http://schemas.microsoft.com/office/drawing/2016/5/13/chartex" xmlns:cx8="http://schemas.microsoft.com/office/drawing/2016/5/14/chartex" xmlns:mc="http://schemas.openxmlformats.org/markup-compatibility/2006" xmlns:aink="http://schemas.microsoft.com/office/drawing/2016/ink" xmlns:am3d="http://schemas.microsoft.com/office/drawing/2017/model3d" xmlns:o="urn:schemas-microsoft-com:office:office" xmlns:oel="http://schemas.microsoft.com/office/2019/extlst" xmlns:r="http://schemas.openxmlformats.org/officeDocument/2006/relationships" xmlns:m="http://schemas.openxmlformats.org/officeDocument/2006/math" xmlns:v="urn:schemas-microsoft-com:vml" xmlns:wp14="http://schemas.microsoft.com/office/word/2010/wordprocessingDrawing" xmlns:wp="http://schemas.openxmlformats.org/drawingml/2006/wordprocessingDrawing" xmlns:w10="urn:schemas-microsoft-com:office:word" xmlns:w="http://schemas.openxmlformats.org/wordprocessingml/2006/main" xmlns:w14="http://schemas.microsoft.com/office/word/2010/wordml" xmlns:w15="http://schemas.microsoft.com/office/word/2012/wordml" xmlns:w16cex="http://schemas.microsoft.com/office/word/2018/wordml/cex" xmlns:w16cid="http://schemas.microsoft.com/office/word/2016/wordml/cid" xmlns:w16="http://schemas.microsoft.com/office/word/2018/wordml" xmlns:w16sdtdh="http://schemas.microsoft.com/office/word/2020/wordml/sdtdatahash" xmlns:w16se="http://schemas.microsoft.com/office/word/2015/wordml/symex" xmlns:wpg="http://schemas.microsoft.com/office/word/2010/wordprocessingGroup" xmlns:wpi="http://schemas.microsoft.com/office/word/2010/wordprocessingInk" xmlns:wne="http://schemas.microsoft.com/office/word/2006/wordml" xmlns:wps="http://schemas.microsoft.com/office/word/2010/wordprocessingShape" mc:Ignorable="w14 w15 w16se w16cid w16 w16cex w16sdtdh wp14">
   <w:abstractNum w:abstractNumId="0" w15:restartNumberingAfterBreak="0">
+    <w:nsid w:val="012E7297"/>
+    <w:multiLevelType w:val="multilevel"/>
+    <w:tmpl w:val="BDCAA5E6"/>
+    <w:lvl w:ilvl="0">
+      <w:start w:val="1"/>
+      <w:numFmt w:val="bullet"/>
+      <w:lvlText w:val=""/>
+      <w:lvlJc w:val="left"/>
+      <w:pPr>
+        <w:tabs>
+          <w:tab w:val="num" w:pos="720"/>
+        </w:tabs>
+        <w:ind w:left="720" w:hanging="360"/>
+      </w:pPr>
+      <w:rPr>
+        <w:rFonts w:ascii="Symbol" w:hAnsi="Symbol" w:hint="default"/>
+        <w:sz w:val="20"/>
+      </w:rPr>
+    </w:lvl>
+    <w:lvl w:ilvl="1" w:tentative="1">
+      <w:start w:val="1"/>
+      <w:numFmt w:val="bullet"/>
+      <w:lvlText w:val="o"/>
+      <w:lvlJc w:val="left"/>
+      <w:pPr>
+        <w:tabs>
+          <w:tab w:val="num" w:pos="1440"/>
+        </w:tabs>
+        <w:ind w:left="1440" w:hanging="360"/>
+      </w:pPr>
+      <w:rPr>
+        <w:rFonts w:ascii="Courier New" w:hAnsi="Courier New" w:hint="default"/>
+        <w:sz w:val="20"/>
+      </w:rPr>
+    </w:lvl>
+    <w:lvl w:ilvl="2" w:tentative="1">
+      <w:start w:val="1"/>
+      <w:numFmt w:val="bullet"/>
+      <w:lvlText w:val=""/>
+      <w:lvlJc w:val="left"/>
+      <w:pPr>
+        <w:tabs>
+          <w:tab w:val="num" w:pos="2160"/>
+        </w:tabs>
+        <w:ind w:left="2160" w:hanging="360"/>
+      </w:pPr>
+      <w:rPr>
+        <w:rFonts w:ascii="Wingdings" w:hAnsi="Wingdings" w:hint="default"/>
+        <w:sz w:val="20"/>
+      </w:rPr>
+    </w:lvl>
+    <w:lvl w:ilvl="3" w:tentative="1">
+      <w:start w:val="1"/>
+      <w:numFmt w:val="bullet"/>
+      <w:lvlText w:val=""/>
+      <w:lvlJc w:val="left"/>
+      <w:pPr>
+        <w:tabs>
+          <w:tab w:val="num" w:pos="2880"/>
+        </w:tabs>
+        <w:ind w:left="2880" w:hanging="360"/>
+      </w:pPr>
+      <w:rPr>
+        <w:rFonts w:ascii="Wingdings" w:hAnsi="Wingdings" w:hint="default"/>
+        <w:sz w:val="20"/>
+      </w:rPr>
+    </w:lvl>
+    <w:lvl w:ilvl="4" w:tentative="1">
+      <w:start w:val="1"/>
+      <w:numFmt w:val="bullet"/>
+      <w:lvlText w:val=""/>
+      <w:lvlJc w:val="left"/>
+      <w:pPr>
+        <w:tabs>
+          <w:tab w:val="num" w:pos="3600"/>
+        </w:tabs>
+        <w:ind w:left="3600" w:hanging="360"/>
+      </w:pPr>
+      <w:rPr>
+        <w:rFonts w:ascii="Wingdings" w:hAnsi="Wingdings" w:hint="default"/>
+        <w:sz w:val="20"/>
+      </w:rPr>
+    </w:lvl>
+    <w:lvl w:ilvl="5" w:tentative="1">
+      <w:start w:val="1"/>
+      <w:numFmt w:val="bullet"/>
+      <w:lvlText w:val=""/>
+      <w:lvlJc w:val="left"/>
+      <w:pPr>
+        <w:tabs>
+          <w:tab w:val="num" w:pos="4320"/>
+        </w:tabs>
+        <w:ind w:left="4320" w:hanging="360"/>
+      </w:pPr>
+      <w:rPr>
+        <w:rFonts w:ascii="Wingdings" w:hAnsi="Wingdings" w:hint="default"/>
+        <w:sz w:val="20"/>
+      </w:rPr>
+    </w:lvl>
+    <w:lvl w:ilvl="6" w:tentative="1">
+      <w:start w:val="1"/>
+      <w:numFmt w:val="bullet"/>
+      <w:lvlText w:val=""/>
+      <w:lvlJc w:val="left"/>
+      <w:pPr>
+        <w:tabs>
+          <w:tab w:val="num" w:pos="5040"/>
+        </w:tabs>
+        <w:ind w:left="5040" w:hanging="360"/>
+      </w:pPr>
+      <w:rPr>
+        <w:rFonts w:ascii="Wingdings" w:hAnsi="Wingdings" w:hint="default"/>
+        <w:sz w:val="20"/>
+      </w:rPr>
+    </w:lvl>
+    <w:lvl w:ilvl="7" w:tentative="1">
+      <w:start w:val="1"/>
+      <w:numFmt w:val="bullet"/>
+      <w:lvlText w:val=""/>
+      <w:lvlJc w:val="left"/>
+      <w:pPr>
+        <w:tabs>
+          <w:tab w:val="num" w:pos="5760"/>
+        </w:tabs>
+        <w:ind w:left="5760" w:hanging="360"/>
+      </w:pPr>
+      <w:rPr>
+        <w:rFonts w:ascii="Wingdings" w:hAnsi="Wingdings" w:hint="default"/>
+        <w:sz w:val="20"/>
+      </w:rPr>
+    </w:lvl>
+    <w:lvl w:ilvl="8" w:tentative="1">
+      <w:start w:val="1"/>
+      <w:numFmt w:val="bullet"/>
+      <w:lvlText w:val=""/>
+      <w:lvlJc w:val="left"/>
+      <w:pPr>
+        <w:tabs>
+          <w:tab w:val="num" w:pos="6480"/>
+        </w:tabs>
+        <w:ind w:left="6480" w:hanging="360"/>
+      </w:pPr>
+      <w:rPr>
+        <w:rFonts w:ascii="Wingdings" w:hAnsi="Wingdings" w:hint="default"/>
+        <w:sz w:val="20"/>
+      </w:rPr>
+    </w:lvl>
+  </w:abstractNum>
+  <w:abstractNum w:abstractNumId="1" w15:restartNumberingAfterBreak="0">
     <w:nsid w:val="04A97111"/>
     <w:multiLevelType w:val="multilevel"/>
     <w:tmpl w:val="C58AB752"/>
@@ -7889,7 +9908,7 @@
       </w:rPr>
     </w:lvl>
   </w:abstractNum>
-  <w:abstractNum w:abstractNumId="1" w15:restartNumberingAfterBreak="0">
+  <w:abstractNum w:abstractNumId="2" w15:restartNumberingAfterBreak="0">
     <w:nsid w:val="09332B4A"/>
     <w:multiLevelType w:val="hybridMultilevel"/>
     <w:tmpl w:val="8A86C9C0"/>
@@ -7978,7 +9997,7 @@
       </w:pPr>
     </w:lvl>
   </w:abstractNum>
-  <w:abstractNum w:abstractNumId="2" w15:restartNumberingAfterBreak="0">
+  <w:abstractNum w:abstractNumId="3" w15:restartNumberingAfterBreak="0">
     <w:nsid w:val="20760212"/>
     <w:multiLevelType w:val="hybridMultilevel"/>
     <w:tmpl w:val="46A21DE2"/>
@@ -8067,130 +10086,121 @@
       </w:pPr>
     </w:lvl>
   </w:abstractNum>
-  <w:abstractNum w:abstractNumId="3" w15:restartNumberingAfterBreak="0">
-    <w:nsid w:val="42B83D0D"/>
-    <w:multiLevelType w:val="multilevel"/>
-    <w:tmpl w:val="B858AC80"/>
-    <w:lvl w:ilvl="0">
-      <w:start w:val="2"/>
-      <w:numFmt w:val="decimal"/>
-      <w:lvlText w:val="%1"/>
+  <w:abstractNum w:abstractNumId="4" w15:restartNumberingAfterBreak="0">
+    <w:nsid w:val="25130CBC"/>
+    <w:multiLevelType w:val="hybridMultilevel"/>
+    <w:tmpl w:val="892E0C60"/>
+    <w:lvl w:ilvl="0" w:tplc="04190001">
+      <w:start w:val="1"/>
+      <w:numFmt w:val="bullet"/>
+      <w:lvlText w:val=""/>
       <w:lvlJc w:val="left"/>
       <w:pPr>
-        <w:ind w:left="360" w:hanging="360"/>
+        <w:ind w:left="720" w:hanging="360"/>
       </w:pPr>
       <w:rPr>
-        <w:rFonts w:hint="default"/>
-        <w:sz w:val="28"/>
+        <w:rFonts w:ascii="Symbol" w:hAnsi="Symbol" w:hint="default"/>
       </w:rPr>
     </w:lvl>
-    <w:lvl w:ilvl="1">
+    <w:lvl w:ilvl="1" w:tplc="04190003" w:tentative="1">
       <w:start w:val="1"/>
-      <w:numFmt w:val="decimal"/>
-      <w:lvlText w:val="%1.%2"/>
+      <w:numFmt w:val="bullet"/>
+      <w:lvlText w:val="o"/>
       <w:lvlJc w:val="left"/>
       <w:pPr>
-        <w:ind w:left="1287" w:hanging="720"/>
+        <w:ind w:left="1440" w:hanging="360"/>
       </w:pPr>
       <w:rPr>
-        <w:rFonts w:hint="default"/>
-        <w:sz w:val="28"/>
+        <w:rFonts w:ascii="Courier New" w:hAnsi="Courier New" w:cs="Courier New" w:hint="default"/>
       </w:rPr>
     </w:lvl>
-    <w:lvl w:ilvl="2">
+    <w:lvl w:ilvl="2" w:tplc="04190005" w:tentative="1">
       <w:start w:val="1"/>
-      <w:numFmt w:val="decimal"/>
-      <w:lvlText w:val="%1.%2.%3"/>
+      <w:numFmt w:val="bullet"/>
+      <w:lvlText w:val=""/>
       <w:lvlJc w:val="left"/>
       <w:pPr>
-        <w:ind w:left="2214" w:hanging="1080"/>
+        <w:ind w:left="2160" w:hanging="360"/>
       </w:pPr>
       <w:rPr>
-        <w:rFonts w:hint="default"/>
-        <w:sz w:val="28"/>
+        <w:rFonts w:ascii="Wingdings" w:hAnsi="Wingdings" w:hint="default"/>
       </w:rPr>
     </w:lvl>
-    <w:lvl w:ilvl="3">
+    <w:lvl w:ilvl="3" w:tplc="04190001" w:tentative="1">
       <w:start w:val="1"/>
-      <w:numFmt w:val="decimal"/>
-      <w:lvlText w:val="%1.%2.%3.%4"/>
+      <w:numFmt w:val="bullet"/>
+      <w:lvlText w:val=""/>
       <w:lvlJc w:val="left"/>
       <w:pPr>
-        <w:ind w:left="3141" w:hanging="1440"/>
+        <w:ind w:left="2880" w:hanging="360"/>
       </w:pPr>
       <w:rPr>
-        <w:rFonts w:hint="default"/>
-        <w:sz w:val="28"/>
+        <w:rFonts w:ascii="Symbol" w:hAnsi="Symbol" w:hint="default"/>
       </w:rPr>
     </w:lvl>
-    <w:lvl w:ilvl="4">
+    <w:lvl w:ilvl="4" w:tplc="04190003" w:tentative="1">
       <w:start w:val="1"/>
-      <w:numFmt w:val="decimal"/>
-      <w:lvlText w:val="%1.%2.%3.%4.%5"/>
+      <w:numFmt w:val="bullet"/>
+      <w:lvlText w:val="o"/>
       <w:lvlJc w:val="left"/>
       <w:pPr>
-        <w:ind w:left="3708" w:hanging="1440"/>
+        <w:ind w:left="3600" w:hanging="360"/>
       </w:pPr>
       <w:rPr>
-        <w:rFonts w:hint="default"/>
-        <w:sz w:val="28"/>
+        <w:rFonts w:ascii="Courier New" w:hAnsi="Courier New" w:cs="Courier New" w:hint="default"/>
       </w:rPr>
     </w:lvl>
-    <w:lvl w:ilvl="5">
+    <w:lvl w:ilvl="5" w:tplc="04190005" w:tentative="1">
       <w:start w:val="1"/>
-      <w:numFmt w:val="decimal"/>
-      <w:lvlText w:val="%1.%2.%3.%4.%5.%6"/>
+      <w:numFmt w:val="bullet"/>
+      <w:lvlText w:val=""/>
       <w:lvlJc w:val="left"/>
       <w:pPr>
-        <w:ind w:left="4635" w:hanging="1800"/>
+        <w:ind w:left="4320" w:hanging="360"/>
       </w:pPr>
       <w:rPr>
-        <w:rFonts w:hint="default"/>
-        <w:sz w:val="28"/>
+        <w:rFonts w:ascii="Wingdings" w:hAnsi="Wingdings" w:hint="default"/>
       </w:rPr>
     </w:lvl>
-    <w:lvl w:ilvl="6">
+    <w:lvl w:ilvl="6" w:tplc="04190001" w:tentative="1">
       <w:start w:val="1"/>
-      <w:numFmt w:val="decimal"/>
-      <w:lvlText w:val="%1.%2.%3.%4.%5.%6.%7"/>
+      <w:numFmt w:val="bullet"/>
+      <w:lvlText w:val=""/>
       <w:lvlJc w:val="left"/>
       <w:pPr>
-        <w:ind w:left="5562" w:hanging="2160"/>
+        <w:ind w:left="5040" w:hanging="360"/>
       </w:pPr>
       <w:rPr>
-        <w:rFonts w:hint="default"/>
-        <w:sz w:val="28"/>
+        <w:rFonts w:ascii="Symbol" w:hAnsi="Symbol" w:hint="default"/>
       </w:rPr>
     </w:lvl>
-    <w:lvl w:ilvl="7">
+    <w:lvl w:ilvl="7" w:tplc="04190003" w:tentative="1">
       <w:start w:val="1"/>
-      <w:numFmt w:val="decimal"/>
-      <w:lvlText w:val="%1.%2.%3.%4.%5.%6.%7.%8"/>
+      <w:numFmt w:val="bullet"/>
+      <w:lvlText w:val="o"/>
       <w:lvlJc w:val="left"/>
       <w:pPr>
-        <w:ind w:left="6489" w:hanging="2520"/>
+        <w:ind w:left="5760" w:hanging="360"/>
       </w:pPr>
       <w:rPr>
-        <w:rFonts w:hint="default"/>
-        <w:sz w:val="28"/>
+        <w:rFonts w:ascii="Courier New" w:hAnsi="Courier New" w:cs="Courier New" w:hint="default"/>
       </w:rPr>
     </w:lvl>
-    <w:lvl w:ilvl="8">
+    <w:lvl w:ilvl="8" w:tplc="04190005" w:tentative="1">
       <w:start w:val="1"/>
-      <w:numFmt w:val="decimal"/>
-      <w:lvlText w:val="%1.%2.%3.%4.%5.%6.%7.%8.%9"/>
+      <w:numFmt w:val="bullet"/>
+      <w:lvlText w:val=""/>
       <w:lvlJc w:val="left"/>
       <w:pPr>
-        <w:ind w:left="7416" w:hanging="2880"/>
+        <w:ind w:left="6480" w:hanging="360"/>
       </w:pPr>
       <w:rPr>
-        <w:rFonts w:hint="default"/>
-        <w:sz w:val="28"/>
+        <w:rFonts w:ascii="Wingdings" w:hAnsi="Wingdings" w:hint="default"/>
       </w:rPr>
     </w:lvl>
   </w:abstractNum>
-  <w:abstractNum w:abstractNumId="4" w15:restartNumberingAfterBreak="0">
-    <w:nsid w:val="447579D3"/>
+  <w:abstractNum w:abstractNumId="5" w15:restartNumberingAfterBreak="0">
+    <w:nsid w:val="27406A6D"/>
     <w:multiLevelType w:val="multilevel"/>
     <w:tmpl w:val="E062D2CE"/>
     <w:lvl w:ilvl="0">
@@ -8318,7 +10328,536 @@
       </w:rPr>
     </w:lvl>
   </w:abstractNum>
-  <w:abstractNum w:abstractNumId="5" w15:restartNumberingAfterBreak="0">
+  <w:abstractNum w:abstractNumId="6" w15:restartNumberingAfterBreak="0">
+    <w:nsid w:val="27AA62F0"/>
+    <w:multiLevelType w:val="multilevel"/>
+    <w:tmpl w:val="E062D2CE"/>
+    <w:lvl w:ilvl="0">
+      <w:start w:val="1"/>
+      <w:numFmt w:val="decimal"/>
+      <w:lvlText w:val="%1."/>
+      <w:lvlJc w:val="left"/>
+      <w:pPr>
+        <w:ind w:left="720" w:hanging="360"/>
+      </w:pPr>
+      <w:rPr>
+        <w:rFonts w:hint="default"/>
+      </w:rPr>
+    </w:lvl>
+    <w:lvl w:ilvl="1">
+      <w:start w:val="1"/>
+      <w:numFmt w:val="decimal"/>
+      <w:isLgl/>
+      <w:lvlText w:val="%1.%2."/>
+      <w:lvlJc w:val="left"/>
+      <w:pPr>
+        <w:ind w:left="780" w:hanging="420"/>
+      </w:pPr>
+      <w:rPr>
+        <w:rFonts w:hint="default"/>
+        <w:sz w:val="24"/>
+      </w:rPr>
+    </w:lvl>
+    <w:lvl w:ilvl="2">
+      <w:start w:val="1"/>
+      <w:numFmt w:val="decimal"/>
+      <w:isLgl/>
+      <w:lvlText w:val="%1.%2.%3."/>
+      <w:lvlJc w:val="left"/>
+      <w:pPr>
+        <w:ind w:left="1080" w:hanging="720"/>
+      </w:pPr>
+      <w:rPr>
+        <w:rFonts w:hint="default"/>
+        <w:sz w:val="24"/>
+      </w:rPr>
+    </w:lvl>
+    <w:lvl w:ilvl="3">
+      <w:start w:val="1"/>
+      <w:numFmt w:val="decimal"/>
+      <w:isLgl/>
+      <w:lvlText w:val="%1.%2.%3.%4."/>
+      <w:lvlJc w:val="left"/>
+      <w:pPr>
+        <w:ind w:left="1080" w:hanging="720"/>
+      </w:pPr>
+      <w:rPr>
+        <w:rFonts w:hint="default"/>
+        <w:sz w:val="24"/>
+      </w:rPr>
+    </w:lvl>
+    <w:lvl w:ilvl="4">
+      <w:start w:val="1"/>
+      <w:numFmt w:val="decimal"/>
+      <w:isLgl/>
+      <w:lvlText w:val="%1.%2.%3.%4.%5."/>
+      <w:lvlJc w:val="left"/>
+      <w:pPr>
+        <w:ind w:left="1440" w:hanging="1080"/>
+      </w:pPr>
+      <w:rPr>
+        <w:rFonts w:hint="default"/>
+        <w:sz w:val="24"/>
+      </w:rPr>
+    </w:lvl>
+    <w:lvl w:ilvl="5">
+      <w:start w:val="1"/>
+      <w:numFmt w:val="decimal"/>
+      <w:isLgl/>
+      <w:lvlText w:val="%1.%2.%3.%4.%5.%6."/>
+      <w:lvlJc w:val="left"/>
+      <w:pPr>
+        <w:ind w:left="1440" w:hanging="1080"/>
+      </w:pPr>
+      <w:rPr>
+        <w:rFonts w:hint="default"/>
+        <w:sz w:val="24"/>
+      </w:rPr>
+    </w:lvl>
+    <w:lvl w:ilvl="6">
+      <w:start w:val="1"/>
+      <w:numFmt w:val="decimal"/>
+      <w:isLgl/>
+      <w:lvlText w:val="%1.%2.%3.%4.%5.%6.%7."/>
+      <w:lvlJc w:val="left"/>
+      <w:pPr>
+        <w:ind w:left="1800" w:hanging="1440"/>
+      </w:pPr>
+      <w:rPr>
+        <w:rFonts w:hint="default"/>
+        <w:sz w:val="24"/>
+      </w:rPr>
+    </w:lvl>
+    <w:lvl w:ilvl="7">
+      <w:start w:val="1"/>
+      <w:numFmt w:val="decimal"/>
+      <w:isLgl/>
+      <w:lvlText w:val="%1.%2.%3.%4.%5.%6.%7.%8."/>
+      <w:lvlJc w:val="left"/>
+      <w:pPr>
+        <w:ind w:left="1800" w:hanging="1440"/>
+      </w:pPr>
+      <w:rPr>
+        <w:rFonts w:hint="default"/>
+        <w:sz w:val="24"/>
+      </w:rPr>
+    </w:lvl>
+    <w:lvl w:ilvl="8">
+      <w:start w:val="1"/>
+      <w:numFmt w:val="decimal"/>
+      <w:isLgl/>
+      <w:lvlText w:val="%1.%2.%3.%4.%5.%6.%7.%8.%9."/>
+      <w:lvlJc w:val="left"/>
+      <w:pPr>
+        <w:ind w:left="2160" w:hanging="1800"/>
+      </w:pPr>
+      <w:rPr>
+        <w:rFonts w:hint="default"/>
+        <w:sz w:val="24"/>
+      </w:rPr>
+    </w:lvl>
+  </w:abstractNum>
+  <w:abstractNum w:abstractNumId="7" w15:restartNumberingAfterBreak="0">
+    <w:nsid w:val="29001FDF"/>
+    <w:multiLevelType w:val="multilevel"/>
+    <w:tmpl w:val="C47EA3DC"/>
+    <w:lvl w:ilvl="0">
+      <w:start w:val="1"/>
+      <w:numFmt w:val="bullet"/>
+      <w:lvlText w:val=""/>
+      <w:lvlJc w:val="left"/>
+      <w:pPr>
+        <w:tabs>
+          <w:tab w:val="num" w:pos="720"/>
+        </w:tabs>
+        <w:ind w:left="720" w:hanging="360"/>
+      </w:pPr>
+      <w:rPr>
+        <w:rFonts w:ascii="Symbol" w:hAnsi="Symbol" w:hint="default"/>
+        <w:sz w:val="20"/>
+      </w:rPr>
+    </w:lvl>
+    <w:lvl w:ilvl="1" w:tentative="1">
+      <w:start w:val="1"/>
+      <w:numFmt w:val="bullet"/>
+      <w:lvlText w:val="o"/>
+      <w:lvlJc w:val="left"/>
+      <w:pPr>
+        <w:tabs>
+          <w:tab w:val="num" w:pos="1440"/>
+        </w:tabs>
+        <w:ind w:left="1440" w:hanging="360"/>
+      </w:pPr>
+      <w:rPr>
+        <w:rFonts w:ascii="Courier New" w:hAnsi="Courier New" w:hint="default"/>
+        <w:sz w:val="20"/>
+      </w:rPr>
+    </w:lvl>
+    <w:lvl w:ilvl="2" w:tentative="1">
+      <w:start w:val="1"/>
+      <w:numFmt w:val="bullet"/>
+      <w:lvlText w:val=""/>
+      <w:lvlJc w:val="left"/>
+      <w:pPr>
+        <w:tabs>
+          <w:tab w:val="num" w:pos="2160"/>
+        </w:tabs>
+        <w:ind w:left="2160" w:hanging="360"/>
+      </w:pPr>
+      <w:rPr>
+        <w:rFonts w:ascii="Wingdings" w:hAnsi="Wingdings" w:hint="default"/>
+        <w:sz w:val="20"/>
+      </w:rPr>
+    </w:lvl>
+    <w:lvl w:ilvl="3" w:tentative="1">
+      <w:start w:val="1"/>
+      <w:numFmt w:val="bullet"/>
+      <w:lvlText w:val=""/>
+      <w:lvlJc w:val="left"/>
+      <w:pPr>
+        <w:tabs>
+          <w:tab w:val="num" w:pos="2880"/>
+        </w:tabs>
+        <w:ind w:left="2880" w:hanging="360"/>
+      </w:pPr>
+      <w:rPr>
+        <w:rFonts w:ascii="Wingdings" w:hAnsi="Wingdings" w:hint="default"/>
+        <w:sz w:val="20"/>
+      </w:rPr>
+    </w:lvl>
+    <w:lvl w:ilvl="4" w:tentative="1">
+      <w:start w:val="1"/>
+      <w:numFmt w:val="bullet"/>
+      <w:lvlText w:val=""/>
+      <w:lvlJc w:val="left"/>
+      <w:pPr>
+        <w:tabs>
+          <w:tab w:val="num" w:pos="3600"/>
+        </w:tabs>
+        <w:ind w:left="3600" w:hanging="360"/>
+      </w:pPr>
+      <w:rPr>
+        <w:rFonts w:ascii="Wingdings" w:hAnsi="Wingdings" w:hint="default"/>
+        <w:sz w:val="20"/>
+      </w:rPr>
+    </w:lvl>
+    <w:lvl w:ilvl="5" w:tentative="1">
+      <w:start w:val="1"/>
+      <w:numFmt w:val="bullet"/>
+      <w:lvlText w:val=""/>
+      <w:lvlJc w:val="left"/>
+      <w:pPr>
+        <w:tabs>
+          <w:tab w:val="num" w:pos="4320"/>
+        </w:tabs>
+        <w:ind w:left="4320" w:hanging="360"/>
+      </w:pPr>
+      <w:rPr>
+        <w:rFonts w:ascii="Wingdings" w:hAnsi="Wingdings" w:hint="default"/>
+        <w:sz w:val="20"/>
+      </w:rPr>
+    </w:lvl>
+    <w:lvl w:ilvl="6" w:tentative="1">
+      <w:start w:val="1"/>
+      <w:numFmt w:val="bullet"/>
+      <w:lvlText w:val=""/>
+      <w:lvlJc w:val="left"/>
+      <w:pPr>
+        <w:tabs>
+          <w:tab w:val="num" w:pos="5040"/>
+        </w:tabs>
+        <w:ind w:left="5040" w:hanging="360"/>
+      </w:pPr>
+      <w:rPr>
+        <w:rFonts w:ascii="Wingdings" w:hAnsi="Wingdings" w:hint="default"/>
+        <w:sz w:val="20"/>
+      </w:rPr>
+    </w:lvl>
+    <w:lvl w:ilvl="7" w:tentative="1">
+      <w:start w:val="1"/>
+      <w:numFmt w:val="bullet"/>
+      <w:lvlText w:val=""/>
+      <w:lvlJc w:val="left"/>
+      <w:pPr>
+        <w:tabs>
+          <w:tab w:val="num" w:pos="5760"/>
+        </w:tabs>
+        <w:ind w:left="5760" w:hanging="360"/>
+      </w:pPr>
+      <w:rPr>
+        <w:rFonts w:ascii="Wingdings" w:hAnsi="Wingdings" w:hint="default"/>
+        <w:sz w:val="20"/>
+      </w:rPr>
+    </w:lvl>
+    <w:lvl w:ilvl="8" w:tentative="1">
+      <w:start w:val="1"/>
+      <w:numFmt w:val="bullet"/>
+      <w:lvlText w:val=""/>
+      <w:lvlJc w:val="left"/>
+      <w:pPr>
+        <w:tabs>
+          <w:tab w:val="num" w:pos="6480"/>
+        </w:tabs>
+        <w:ind w:left="6480" w:hanging="360"/>
+      </w:pPr>
+      <w:rPr>
+        <w:rFonts w:ascii="Wingdings" w:hAnsi="Wingdings" w:hint="default"/>
+        <w:sz w:val="20"/>
+      </w:rPr>
+    </w:lvl>
+  </w:abstractNum>
+  <w:abstractNum w:abstractNumId="8" w15:restartNumberingAfterBreak="0">
+    <w:nsid w:val="42B83D0D"/>
+    <w:multiLevelType w:val="multilevel"/>
+    <w:tmpl w:val="B858AC80"/>
+    <w:lvl w:ilvl="0">
+      <w:start w:val="2"/>
+      <w:numFmt w:val="decimal"/>
+      <w:lvlText w:val="%1"/>
+      <w:lvlJc w:val="left"/>
+      <w:pPr>
+        <w:ind w:left="360" w:hanging="360"/>
+      </w:pPr>
+      <w:rPr>
+        <w:rFonts w:hint="default"/>
+        <w:sz w:val="28"/>
+      </w:rPr>
+    </w:lvl>
+    <w:lvl w:ilvl="1">
+      <w:start w:val="1"/>
+      <w:numFmt w:val="decimal"/>
+      <w:lvlText w:val="%1.%2"/>
+      <w:lvlJc w:val="left"/>
+      <w:pPr>
+        <w:ind w:left="1287" w:hanging="720"/>
+      </w:pPr>
+      <w:rPr>
+        <w:rFonts w:hint="default"/>
+        <w:sz w:val="28"/>
+      </w:rPr>
+    </w:lvl>
+    <w:lvl w:ilvl="2">
+      <w:start w:val="1"/>
+      <w:numFmt w:val="decimal"/>
+      <w:lvlText w:val="%1.%2.%3"/>
+      <w:lvlJc w:val="left"/>
+      <w:pPr>
+        <w:ind w:left="2214" w:hanging="1080"/>
+      </w:pPr>
+      <w:rPr>
+        <w:rFonts w:hint="default"/>
+        <w:sz w:val="28"/>
+      </w:rPr>
+    </w:lvl>
+    <w:lvl w:ilvl="3">
+      <w:start w:val="1"/>
+      <w:numFmt w:val="decimal"/>
+      <w:lvlText w:val="%1.%2.%3.%4"/>
+      <w:lvlJc w:val="left"/>
+      <w:pPr>
+        <w:ind w:left="3141" w:hanging="1440"/>
+      </w:pPr>
+      <w:rPr>
+        <w:rFonts w:hint="default"/>
+        <w:sz w:val="28"/>
+      </w:rPr>
+    </w:lvl>
+    <w:lvl w:ilvl="4">
+      <w:start w:val="1"/>
+      <w:numFmt w:val="decimal"/>
+      <w:lvlText w:val="%1.%2.%3.%4.%5"/>
+      <w:lvlJc w:val="left"/>
+      <w:pPr>
+        <w:ind w:left="3708" w:hanging="1440"/>
+      </w:pPr>
+      <w:rPr>
+        <w:rFonts w:hint="default"/>
+        <w:sz w:val="28"/>
+      </w:rPr>
+    </w:lvl>
+    <w:lvl w:ilvl="5">
+      <w:start w:val="1"/>
+      <w:numFmt w:val="decimal"/>
+      <w:lvlText w:val="%1.%2.%3.%4.%5.%6"/>
+      <w:lvlJc w:val="left"/>
+      <w:pPr>
+        <w:ind w:left="4635" w:hanging="1800"/>
+      </w:pPr>
+      <w:rPr>
+        <w:rFonts w:hint="default"/>
+        <w:sz w:val="28"/>
+      </w:rPr>
+    </w:lvl>
+    <w:lvl w:ilvl="6">
+      <w:start w:val="1"/>
+      <w:numFmt w:val="decimal"/>
+      <w:lvlText w:val="%1.%2.%3.%4.%5.%6.%7"/>
+      <w:lvlJc w:val="left"/>
+      <w:pPr>
+        <w:ind w:left="5562" w:hanging="2160"/>
+      </w:pPr>
+      <w:rPr>
+        <w:rFonts w:hint="default"/>
+        <w:sz w:val="28"/>
+      </w:rPr>
+    </w:lvl>
+    <w:lvl w:ilvl="7">
+      <w:start w:val="1"/>
+      <w:numFmt w:val="decimal"/>
+      <w:lvlText w:val="%1.%2.%3.%4.%5.%6.%7.%8"/>
+      <w:lvlJc w:val="left"/>
+      <w:pPr>
+        <w:ind w:left="6489" w:hanging="2520"/>
+      </w:pPr>
+      <w:rPr>
+        <w:rFonts w:hint="default"/>
+        <w:sz w:val="28"/>
+      </w:rPr>
+    </w:lvl>
+    <w:lvl w:ilvl="8">
+      <w:start w:val="1"/>
+      <w:numFmt w:val="decimal"/>
+      <w:lvlText w:val="%1.%2.%3.%4.%5.%6.%7.%8.%9"/>
+      <w:lvlJc w:val="left"/>
+      <w:pPr>
+        <w:ind w:left="7416" w:hanging="2880"/>
+      </w:pPr>
+      <w:rPr>
+        <w:rFonts w:hint="default"/>
+        <w:sz w:val="28"/>
+      </w:rPr>
+    </w:lvl>
+  </w:abstractNum>
+  <w:abstractNum w:abstractNumId="9" w15:restartNumberingAfterBreak="0">
+    <w:nsid w:val="447579D3"/>
+    <w:multiLevelType w:val="multilevel"/>
+    <w:tmpl w:val="E062D2CE"/>
+    <w:lvl w:ilvl="0">
+      <w:start w:val="1"/>
+      <w:numFmt w:val="decimal"/>
+      <w:lvlText w:val="%1."/>
+      <w:lvlJc w:val="left"/>
+      <w:pPr>
+        <w:ind w:left="720" w:hanging="360"/>
+      </w:pPr>
+      <w:rPr>
+        <w:rFonts w:hint="default"/>
+      </w:rPr>
+    </w:lvl>
+    <w:lvl w:ilvl="1">
+      <w:start w:val="1"/>
+      <w:numFmt w:val="decimal"/>
+      <w:isLgl/>
+      <w:lvlText w:val="%1.%2."/>
+      <w:lvlJc w:val="left"/>
+      <w:pPr>
+        <w:ind w:left="780" w:hanging="420"/>
+      </w:pPr>
+      <w:rPr>
+        <w:rFonts w:hint="default"/>
+        <w:sz w:val="24"/>
+      </w:rPr>
+    </w:lvl>
+    <w:lvl w:ilvl="2">
+      <w:start w:val="1"/>
+      <w:numFmt w:val="decimal"/>
+      <w:isLgl/>
+      <w:lvlText w:val="%1.%2.%3."/>
+      <w:lvlJc w:val="left"/>
+      <w:pPr>
+        <w:ind w:left="1080" w:hanging="720"/>
+      </w:pPr>
+      <w:rPr>
+        <w:rFonts w:hint="default"/>
+        <w:sz w:val="24"/>
+      </w:rPr>
+    </w:lvl>
+    <w:lvl w:ilvl="3">
+      <w:start w:val="1"/>
+      <w:numFmt w:val="decimal"/>
+      <w:isLgl/>
+      <w:lvlText w:val="%1.%2.%3.%4."/>
+      <w:lvlJc w:val="left"/>
+      <w:pPr>
+        <w:ind w:left="1080" w:hanging="720"/>
+      </w:pPr>
+      <w:rPr>
+        <w:rFonts w:hint="default"/>
+        <w:sz w:val="24"/>
+      </w:rPr>
+    </w:lvl>
+    <w:lvl w:ilvl="4">
+      <w:start w:val="1"/>
+      <w:numFmt w:val="decimal"/>
+      <w:isLgl/>
+      <w:lvlText w:val="%1.%2.%3.%4.%5."/>
+      <w:lvlJc w:val="left"/>
+      <w:pPr>
+        <w:ind w:left="1440" w:hanging="1080"/>
+      </w:pPr>
+      <w:rPr>
+        <w:rFonts w:hint="default"/>
+        <w:sz w:val="24"/>
+      </w:rPr>
+    </w:lvl>
+    <w:lvl w:ilvl="5">
+      <w:start w:val="1"/>
+      <w:numFmt w:val="decimal"/>
+      <w:isLgl/>
+      <w:lvlText w:val="%1.%2.%3.%4.%5.%6."/>
+      <w:lvlJc w:val="left"/>
+      <w:pPr>
+        <w:ind w:left="1440" w:hanging="1080"/>
+      </w:pPr>
+      <w:rPr>
+        <w:rFonts w:hint="default"/>
+        <w:sz w:val="24"/>
+      </w:rPr>
+    </w:lvl>
+    <w:lvl w:ilvl="6">
+      <w:start w:val="1"/>
+      <w:numFmt w:val="decimal"/>
+      <w:isLgl/>
+      <w:lvlText w:val="%1.%2.%3.%4.%5.%6.%7."/>
+      <w:lvlJc w:val="left"/>
+      <w:pPr>
+        <w:ind w:left="1800" w:hanging="1440"/>
+      </w:pPr>
+      <w:rPr>
+        <w:rFonts w:hint="default"/>
+        <w:sz w:val="24"/>
+      </w:rPr>
+    </w:lvl>
+    <w:lvl w:ilvl="7">
+      <w:start w:val="1"/>
+      <w:numFmt w:val="decimal"/>
+      <w:isLgl/>
+      <w:lvlText w:val="%1.%2.%3.%4.%5.%6.%7.%8."/>
+      <w:lvlJc w:val="left"/>
+      <w:pPr>
+        <w:ind w:left="1800" w:hanging="1440"/>
+      </w:pPr>
+      <w:rPr>
+        <w:rFonts w:hint="default"/>
+        <w:sz w:val="24"/>
+      </w:rPr>
+    </w:lvl>
+    <w:lvl w:ilvl="8">
+      <w:start w:val="1"/>
+      <w:numFmt w:val="decimal"/>
+      <w:isLgl/>
+      <w:lvlText w:val="%1.%2.%3.%4.%5.%6.%7.%8.%9."/>
+      <w:lvlJc w:val="left"/>
+      <w:pPr>
+        <w:ind w:left="2160" w:hanging="1800"/>
+      </w:pPr>
+      <w:rPr>
+        <w:rFonts w:hint="default"/>
+        <w:sz w:val="24"/>
+      </w:rPr>
+    </w:lvl>
+  </w:abstractNum>
+  <w:abstractNum w:abstractNumId="10" w15:restartNumberingAfterBreak="0">
     <w:nsid w:val="4F5A6620"/>
     <w:multiLevelType w:val="hybridMultilevel"/>
     <w:tmpl w:val="59BCE0F2"/>
@@ -8407,7 +10946,7 @@
       </w:pPr>
     </w:lvl>
   </w:abstractNum>
-  <w:abstractNum w:abstractNumId="6" w15:restartNumberingAfterBreak="0">
+  <w:abstractNum w:abstractNumId="11" w15:restartNumberingAfterBreak="0">
     <w:nsid w:val="591A7815"/>
     <w:multiLevelType w:val="hybridMultilevel"/>
     <w:tmpl w:val="FC7A57BA"/>
@@ -8496,26 +11035,193 @@
       </w:pPr>
     </w:lvl>
   </w:abstractNum>
+  <w:abstractNum w:abstractNumId="12" w15:restartNumberingAfterBreak="0">
+    <w:nsid w:val="6D2D1443"/>
+    <w:multiLevelType w:val="multilevel"/>
+    <w:tmpl w:val="2424FC36"/>
+    <w:lvl w:ilvl="0">
+      <w:start w:val="1"/>
+      <w:numFmt w:val="bullet"/>
+      <w:lvlText w:val=""/>
+      <w:lvlJc w:val="left"/>
+      <w:pPr>
+        <w:tabs>
+          <w:tab w:val="num" w:pos="720"/>
+        </w:tabs>
+        <w:ind w:left="720" w:hanging="360"/>
+      </w:pPr>
+      <w:rPr>
+        <w:rFonts w:ascii="Symbol" w:hAnsi="Symbol" w:hint="default"/>
+        <w:sz w:val="20"/>
+      </w:rPr>
+    </w:lvl>
+    <w:lvl w:ilvl="1" w:tentative="1">
+      <w:start w:val="1"/>
+      <w:numFmt w:val="bullet"/>
+      <w:lvlText w:val="o"/>
+      <w:lvlJc w:val="left"/>
+      <w:pPr>
+        <w:tabs>
+          <w:tab w:val="num" w:pos="1440"/>
+        </w:tabs>
+        <w:ind w:left="1440" w:hanging="360"/>
+      </w:pPr>
+      <w:rPr>
+        <w:rFonts w:ascii="Courier New" w:hAnsi="Courier New" w:hint="default"/>
+        <w:sz w:val="20"/>
+      </w:rPr>
+    </w:lvl>
+    <w:lvl w:ilvl="2" w:tentative="1">
+      <w:start w:val="1"/>
+      <w:numFmt w:val="bullet"/>
+      <w:lvlText w:val=""/>
+      <w:lvlJc w:val="left"/>
+      <w:pPr>
+        <w:tabs>
+          <w:tab w:val="num" w:pos="2160"/>
+        </w:tabs>
+        <w:ind w:left="2160" w:hanging="360"/>
+      </w:pPr>
+      <w:rPr>
+        <w:rFonts w:ascii="Wingdings" w:hAnsi="Wingdings" w:hint="default"/>
+        <w:sz w:val="20"/>
+      </w:rPr>
+    </w:lvl>
+    <w:lvl w:ilvl="3" w:tentative="1">
+      <w:start w:val="1"/>
+      <w:numFmt w:val="bullet"/>
+      <w:lvlText w:val=""/>
+      <w:lvlJc w:val="left"/>
+      <w:pPr>
+        <w:tabs>
+          <w:tab w:val="num" w:pos="2880"/>
+        </w:tabs>
+        <w:ind w:left="2880" w:hanging="360"/>
+      </w:pPr>
+      <w:rPr>
+        <w:rFonts w:ascii="Wingdings" w:hAnsi="Wingdings" w:hint="default"/>
+        <w:sz w:val="20"/>
+      </w:rPr>
+    </w:lvl>
+    <w:lvl w:ilvl="4" w:tentative="1">
+      <w:start w:val="1"/>
+      <w:numFmt w:val="bullet"/>
+      <w:lvlText w:val=""/>
+      <w:lvlJc w:val="left"/>
+      <w:pPr>
+        <w:tabs>
+          <w:tab w:val="num" w:pos="3600"/>
+        </w:tabs>
+        <w:ind w:left="3600" w:hanging="360"/>
+      </w:pPr>
+      <w:rPr>
+        <w:rFonts w:ascii="Wingdings" w:hAnsi="Wingdings" w:hint="default"/>
+        <w:sz w:val="20"/>
+      </w:rPr>
+    </w:lvl>
+    <w:lvl w:ilvl="5" w:tentative="1">
+      <w:start w:val="1"/>
+      <w:numFmt w:val="bullet"/>
+      <w:lvlText w:val=""/>
+      <w:lvlJc w:val="left"/>
+      <w:pPr>
+        <w:tabs>
+          <w:tab w:val="num" w:pos="4320"/>
+        </w:tabs>
+        <w:ind w:left="4320" w:hanging="360"/>
+      </w:pPr>
+      <w:rPr>
+        <w:rFonts w:ascii="Wingdings" w:hAnsi="Wingdings" w:hint="default"/>
+        <w:sz w:val="20"/>
+      </w:rPr>
+    </w:lvl>
+    <w:lvl w:ilvl="6" w:tentative="1">
+      <w:start w:val="1"/>
+      <w:numFmt w:val="bullet"/>
+      <w:lvlText w:val=""/>
+      <w:lvlJc w:val="left"/>
+      <w:pPr>
+        <w:tabs>
+          <w:tab w:val="num" w:pos="5040"/>
+        </w:tabs>
+        <w:ind w:left="5040" w:hanging="360"/>
+      </w:pPr>
+      <w:rPr>
+        <w:rFonts w:ascii="Wingdings" w:hAnsi="Wingdings" w:hint="default"/>
+        <w:sz w:val="20"/>
+      </w:rPr>
+    </w:lvl>
+    <w:lvl w:ilvl="7" w:tentative="1">
+      <w:start w:val="1"/>
+      <w:numFmt w:val="bullet"/>
+      <w:lvlText w:val=""/>
+      <w:lvlJc w:val="left"/>
+      <w:pPr>
+        <w:tabs>
+          <w:tab w:val="num" w:pos="5760"/>
+        </w:tabs>
+        <w:ind w:left="5760" w:hanging="360"/>
+      </w:pPr>
+      <w:rPr>
+        <w:rFonts w:ascii="Wingdings" w:hAnsi="Wingdings" w:hint="default"/>
+        <w:sz w:val="20"/>
+      </w:rPr>
+    </w:lvl>
+    <w:lvl w:ilvl="8" w:tentative="1">
+      <w:start w:val="1"/>
+      <w:numFmt w:val="bullet"/>
+      <w:lvlText w:val=""/>
+      <w:lvlJc w:val="left"/>
+      <w:pPr>
+        <w:tabs>
+          <w:tab w:val="num" w:pos="6480"/>
+        </w:tabs>
+        <w:ind w:left="6480" w:hanging="360"/>
+      </w:pPr>
+      <w:rPr>
+        <w:rFonts w:ascii="Wingdings" w:hAnsi="Wingdings" w:hint="default"/>
+        <w:sz w:val="20"/>
+      </w:rPr>
+    </w:lvl>
+  </w:abstractNum>
   <w:num w:numId="1" w16cid:durableId="765272132">
+    <w:abstractNumId w:val="11"/>
+  </w:num>
+  <w:num w:numId="2" w16cid:durableId="1280603550">
+    <w:abstractNumId w:val="2"/>
+  </w:num>
+  <w:num w:numId="3" w16cid:durableId="435517487">
+    <w:abstractNumId w:val="9"/>
+  </w:num>
+  <w:num w:numId="4" w16cid:durableId="718240523">
+    <w:abstractNumId w:val="3"/>
+  </w:num>
+  <w:num w:numId="5" w16cid:durableId="395593643">
+    <w:abstractNumId w:val="1"/>
+  </w:num>
+  <w:num w:numId="6" w16cid:durableId="2027636951">
+    <w:abstractNumId w:val="10"/>
+  </w:num>
+  <w:num w:numId="7" w16cid:durableId="749816692">
+    <w:abstractNumId w:val="8"/>
+  </w:num>
+  <w:num w:numId="8" w16cid:durableId="1835101558">
+    <w:abstractNumId w:val="4"/>
+  </w:num>
+  <w:num w:numId="9" w16cid:durableId="1421294848">
+    <w:abstractNumId w:val="7"/>
+  </w:num>
+  <w:num w:numId="10" w16cid:durableId="557129504">
+    <w:abstractNumId w:val="12"/>
+  </w:num>
+  <w:num w:numId="11" w16cid:durableId="36779260">
+    <w:abstractNumId w:val="0"/>
+  </w:num>
+  <w:num w:numId="12" w16cid:durableId="1319654721">
     <w:abstractNumId w:val="6"/>
   </w:num>
-  <w:num w:numId="2" w16cid:durableId="1280603550">
-    <w:abstractNumId w:val="1"/>
-  </w:num>
-  <w:num w:numId="3" w16cid:durableId="435517487">
-    <w:abstractNumId w:val="4"/>
-  </w:num>
-  <w:num w:numId="4" w16cid:durableId="718240523">
-    <w:abstractNumId w:val="2"/>
-  </w:num>
-  <w:num w:numId="5" w16cid:durableId="395593643">
-    <w:abstractNumId w:val="0"/>
-  </w:num>
-  <w:num w:numId="6" w16cid:durableId="2027636951">
+  <w:num w:numId="13" w16cid:durableId="739059937">
     <w:abstractNumId w:val="5"/>
-  </w:num>
-  <w:num w:numId="7" w16cid:durableId="749816692">
-    <w:abstractNumId w:val="3"/>
   </w:num>
 </w:numbering>
 </file>
@@ -9495,6 +12201,11 @@
       <w:szCs w:val="20"/>
     </w:rPr>
   </w:style>
+  <w:style w:type="character" w:customStyle="1" w:styleId="internal-embed">
+    <w:name w:val="internal-embed"/>
+    <w:basedOn w:val="a0"/>
+    <w:rsid w:val="000B18D8"/>
+  </w:style>
 </w:styles>
 </file>
 

</xml_diff>